<commit_message>
Ignore temporary document lock files
</commit_message>
<xml_diff>
--- a/Fase 1/Evidencias Grupales/1.5_GuiaEstudiante_Fase 1_Definicion Proyecto APT (Español).docx
+++ b/Fase 1/Evidencias Grupales/1.5_GuiaEstudiante_Fase 1_Definicion Proyecto APT (Español).docx
@@ -416,7 +416,7 @@
     </w:p>
     <w:tbl>
       <w:tblPr>
-        <w:tblStyle w:val="1016"/>
+        <w:tblStyle w:val="1022"/>
         <w:tblInd w:w="-714" w:type="dxa"/>
         <w:tblW w:w="9498" w:type="dxa"/>
         <w:tblBorders>
@@ -523,7 +523,7 @@
     </w:p>
     <w:tbl>
       <w:tblPr>
-        <w:tblStyle w:val="1017"/>
+        <w:tblStyle w:val="1023"/>
         <w:tblInd w:w="-714" w:type="dxa"/>
         <w:tblW w:w="9498" w:type="dxa"/>
         <w:tblBorders>
@@ -819,7 +819,7 @@
     </w:p>
     <w:tbl>
       <w:tblPr>
-        <w:tblStyle w:val="1018"/>
+        <w:tblStyle w:val="1024"/>
         <w:tblInd w:w="-714" w:type="dxa"/>
         <w:tblW w:w="9498" w:type="dxa"/>
         <w:tblBorders>
@@ -922,7 +922,7 @@
     </w:p>
     <w:tbl>
       <w:tblPr>
-        <w:tblStyle w:val="1019"/>
+        <w:tblStyle w:val="1025"/>
         <w:tblInd w:w="-714" w:type="dxa"/>
         <w:tblW w:w="9498" w:type="dxa"/>
         <w:tblBorders>
@@ -1096,7 +1096,7 @@
           </w:p>
           <w:p>
             <w:pPr>
-              <w:pStyle w:val="1000"/>
+              <w:pStyle w:val="1006"/>
               <w:numPr>
                 <w:ilvl w:val="0"/>
                 <w:numId w:val="11"/>
@@ -1125,6 +1125,7 @@
                 <w:sz w:val="20"/>
                 <w:szCs w:val="20"/>
                 <w:highlight w:val="none"/>
+                <w:lang w:val="es-ES"/>
               </w:rPr>
             </w:r>
             <w:r>
@@ -1138,7 +1139,7 @@
           </w:p>
           <w:p>
             <w:pPr>
-              <w:pStyle w:val="1000"/>
+              <w:pStyle w:val="1006"/>
               <w:numPr>
                 <w:ilvl w:val="0"/>
                 <w:numId w:val="11"/>
@@ -1167,6 +1168,7 @@
                 <w:sz w:val="20"/>
                 <w:szCs w:val="20"/>
                 <w:highlight w:val="none"/>
+                <w:lang w:val="es-ES"/>
               </w:rPr>
             </w:r>
             <w:r>
@@ -1180,7 +1182,7 @@
           </w:p>
           <w:p>
             <w:pPr>
-              <w:pStyle w:val="1000"/>
+              <w:pStyle w:val="1006"/>
               <w:numPr>
                 <w:ilvl w:val="0"/>
                 <w:numId w:val="11"/>
@@ -1209,6 +1211,7 @@
                 <w:sz w:val="20"/>
                 <w:szCs w:val="20"/>
                 <w:highlight w:val="none"/>
+                <w:lang w:val="es-ES"/>
               </w:rPr>
             </w:r>
             <w:r>
@@ -1222,7 +1225,7 @@
           </w:p>
           <w:p>
             <w:pPr>
-              <w:pStyle w:val="1000"/>
+              <w:pStyle w:val="1006"/>
               <w:numPr>
                 <w:ilvl w:val="0"/>
                 <w:numId w:val="11"/>
@@ -1251,6 +1254,7 @@
                 <w:sz w:val="20"/>
                 <w:szCs w:val="20"/>
                 <w:highlight w:val="none"/>
+                <w:lang w:val="es-ES"/>
               </w:rPr>
             </w:r>
             <w:r>
@@ -1264,7 +1268,7 @@
           </w:p>
           <w:p>
             <w:pPr>
-              <w:pStyle w:val="1000"/>
+              <w:pStyle w:val="1006"/>
               <w:numPr>
                 <w:ilvl w:val="0"/>
                 <w:numId w:val="11"/>
@@ -1374,7 +1378,7 @@
           </w:tcPr>
           <w:p>
             <w:pPr>
-              <w:pStyle w:val="1000"/>
+              <w:pStyle w:val="1006"/>
               <w:numPr>
                 <w:ilvl w:val="0"/>
                 <w:numId w:val="12"/>
@@ -1410,7 +1414,7 @@
           </w:p>
           <w:p>
             <w:pPr>
-              <w:pStyle w:val="1000"/>
+              <w:pStyle w:val="1006"/>
               <w:numPr>
                 <w:ilvl w:val="0"/>
                 <w:numId w:val="12"/>
@@ -1446,7 +1450,7 @@
           </w:p>
           <w:p>
             <w:pPr>
-              <w:pStyle w:val="1000"/>
+              <w:pStyle w:val="1006"/>
               <w:numPr>
                 <w:ilvl w:val="0"/>
                 <w:numId w:val="12"/>
@@ -1482,7 +1486,7 @@
           </w:p>
           <w:p>
             <w:pPr>
-              <w:pStyle w:val="1000"/>
+              <w:pStyle w:val="1006"/>
               <w:numPr>
                 <w:ilvl w:val="0"/>
                 <w:numId w:val="12"/>
@@ -1525,7 +1529,7 @@
           </w:p>
           <w:p>
             <w:pPr>
-              <w:pStyle w:val="1000"/>
+              <w:pStyle w:val="1006"/>
               <w:numPr>
                 <w:ilvl w:val="0"/>
                 <w:numId w:val="12"/>
@@ -1664,7 +1668,7 @@
     </w:p>
     <w:tbl>
       <w:tblPr>
-        <w:tblStyle w:val="1020"/>
+        <w:tblStyle w:val="1026"/>
         <w:tblInd w:w="-714" w:type="dxa"/>
         <w:tblW w:w="9498" w:type="dxa"/>
         <w:tblBorders>
@@ -1768,7 +1772,7 @@
     </w:p>
     <w:tbl>
       <w:tblPr>
-        <w:tblStyle w:val="1021"/>
+        <w:tblStyle w:val="1027"/>
         <w:tblInd w:w="-714" w:type="dxa"/>
         <w:tblW w:w="9498" w:type="dxa"/>
         <w:tblBorders>
@@ -1994,8 +1998,6 @@
             </w:r>
             <w:r>
               <w:rPr>
-                <w:i/>
-                <w:color w:val="548dd4"/>
                 <w:sz w:val="20"/>
                 <w:szCs w:val="20"/>
               </w:rPr>
@@ -2048,9 +2050,6 @@
             </w:r>
             <w:r>
               <w:rPr>
-                <w:bCs/>
-                <w:i/>
-                <w:color w:val="548dd4"/>
                 <w:sz w:val="20"/>
                 <w:szCs w:val="20"/>
               </w:rPr>
@@ -2089,9 +2088,6 @@
             </w:r>
             <w:r>
               <w:rPr>
-                <w:bCs/>
-                <w:i/>
-                <w:color w:val="548dd4"/>
                 <w:sz w:val="20"/>
                 <w:szCs w:val="20"/>
               </w:rPr>
@@ -2130,6 +2126,15 @@
                 <w:szCs w:val="20"/>
               </w:rPr>
               <w:t xml:space="preserve">a nube y alimenta un panel web móvil en tiempo real, permitiendo al propietario monitorear la recaudación y consultar métricas estratégicas desde cualquier lugar. </w:t>
+            </w:r>
+            <w:r>
+              <w:rPr>
+                <w:bCs/>
+                <w:i/>
+                <w:color w:val="548dd4"/>
+                <w:sz w:val="20"/>
+                <w:szCs w:val="20"/>
+              </w:rPr>
             </w:r>
             <w:r>
               <w:rPr>
@@ -2432,6 +2437,12 @@
                 <w:szCs w:val="20"/>
               </w:rPr>
               <w:t xml:space="preserve">ndo el ciclo de vida mediante historias de usuario y revisiones iterativas. </w:t>
+            </w:r>
+            <w:r>
+              <w:rPr>
+                <w:sz w:val="20"/>
+                <w:szCs w:val="20"/>
+              </w:rPr>
             </w:r>
             <w:r>
               <w:rPr>
@@ -2850,6 +2861,7 @@
               <w:rPr>
                 <w:sz w:val="20"/>
                 <w:szCs w:val="20"/>
+                <w:highlight w:val="none"/>
               </w:rPr>
             </w:r>
             <w:r>
@@ -2905,7 +2917,6 @@
               <w:rPr>
                 <w:sz w:val="20"/>
                 <w:szCs w:val="20"/>
-                <w:highlight w:val="none"/>
               </w:rPr>
             </w:r>
             <w:r>
@@ -3049,7 +3060,7 @@
     </w:p>
     <w:tbl>
       <w:tblPr>
-        <w:tblStyle w:val="1022"/>
+        <w:tblStyle w:val="1028"/>
         <w:tblInd w:w="-714" w:type="dxa"/>
         <w:tblW w:w="9498" w:type="dxa"/>
         <w:tblBorders>
@@ -3157,7 +3168,7 @@
     </w:p>
     <w:tbl>
       <w:tblPr>
-        <w:tblStyle w:val="1023"/>
+        <w:tblStyle w:val="1029"/>
         <w:tblInd w:w="-714" w:type="dxa"/>
         <w:tblW w:w="9495" w:type="dxa"/>
         <w:tblBorders>
@@ -3302,7 +3313,7 @@
           </w:tcPr>
           <w:p>
             <w:pPr>
-              <w:pStyle w:val="1000"/>
+              <w:pStyle w:val="1006"/>
               <w:numPr>
                 <w:ilvl w:val="0"/>
                 <w:numId w:val="13"/>
@@ -3372,10 +3383,16 @@
                 <w:szCs w:val="20"/>
               </w:rPr>
             </w:r>
+            <w:r>
+              <w:rPr>
+                <w:sz w:val="20"/>
+                <w:szCs w:val="20"/>
+              </w:rPr>
+            </w:r>
           </w:p>
           <w:p>
             <w:pPr>
-              <w:pStyle w:val="1000"/>
+              <w:pStyle w:val="1006"/>
               <w:numPr>
                 <w:ilvl w:val="0"/>
                 <w:numId w:val="13"/>
@@ -3409,10 +3426,16 @@
                 <w:szCs w:val="20"/>
               </w:rPr>
             </w:r>
+            <w:r>
+              <w:rPr>
+                <w:sz w:val="20"/>
+                <w:szCs w:val="20"/>
+              </w:rPr>
+            </w:r>
           </w:p>
           <w:p>
             <w:pPr>
-              <w:pStyle w:val="1000"/>
+              <w:pStyle w:val="1006"/>
               <w:numPr>
                 <w:ilvl w:val="0"/>
                 <w:numId w:val="13"/>
@@ -3431,14 +3454,50 @@
                 <w:sz w:val="20"/>
                 <w:szCs w:val="20"/>
               </w:rPr>
-              <w:t xml:space="preserve">Identificar oportunidades de negocio mediante minería de datos transaccional, descubriendo al menos 3 reglas de compra cruzada entre productos y</w:t>
-            </w:r>
-            <w:r>
-              <w:rPr>
-                <w:sz w:val="20"/>
-                <w:szCs w:val="20"/>
-              </w:rPr>
-              <w:t xml:space="preserve"> patrones de demanda horaria para presentar un reporte comercial dentro de 11 semanas, evidenciando al menos una promoción comercial o reubicación de productos implementada en el local a partir de dichos resultados.  </w:t>
+              <w:t xml:space="preserve">Identificar oportunidades de negocio mediante minería de datos transaccional, descubriendo al menos </w:t>
+            </w:r>
+            <w:r>
+              <w:rPr>
+                <w:sz w:val="20"/>
+                <w:szCs w:val="20"/>
+                <w:lang w:val="es-ES"/>
+              </w:rPr>
+              <w:t xml:space="preserve">5</w:t>
+            </w:r>
+            <w:r>
+              <w:rPr>
+                <w:sz w:val="20"/>
+                <w:szCs w:val="20"/>
+              </w:rPr>
+              <w:t xml:space="preserve"> reglas de compra cruzada entre productos y</w:t>
+            </w:r>
+            <w:r>
+              <w:rPr>
+                <w:sz w:val="20"/>
+                <w:szCs w:val="20"/>
+              </w:rPr>
+              <w:t xml:space="preserve"> patrones de demanda horaria para presentar un reporte comercial dentro de 1</w:t>
+            </w:r>
+            <w:r>
+              <w:rPr>
+                <w:sz w:val="20"/>
+                <w:szCs w:val="20"/>
+                <w:lang w:val="es-ES"/>
+              </w:rPr>
+              <w:t xml:space="preserve">0</w:t>
+            </w:r>
+            <w:r>
+              <w:rPr>
+                <w:sz w:val="20"/>
+                <w:szCs w:val="20"/>
+              </w:rPr>
+              <w:t xml:space="preserve"> semanas, evidenciando al menos una promoción comercial o reubicación de productos implementada en el local a partir de dichos resultados.  </w:t>
+            </w:r>
+            <w:r>
+              <w:rPr>
+                <w:sz w:val="20"/>
+                <w:szCs w:val="20"/>
+              </w:rPr>
             </w:r>
             <w:r>
               <w:rPr>
@@ -3449,7 +3508,7 @@
           </w:p>
           <w:p>
             <w:pPr>
-              <w:pStyle w:val="1000"/>
+              <w:pStyle w:val="1006"/>
               <w:numPr>
                 <w:ilvl w:val="0"/>
                 <w:numId w:val="13"/>
@@ -3497,10 +3556,16 @@
                 <w:szCs w:val="20"/>
               </w:rPr>
             </w:r>
+            <w:r>
+              <w:rPr>
+                <w:sz w:val="20"/>
+                <w:szCs w:val="20"/>
+              </w:rPr>
+            </w:r>
           </w:p>
           <w:p>
             <w:pPr>
-              <w:pStyle w:val="1000"/>
+              <w:pStyle w:val="1006"/>
               <w:numPr>
                 <w:ilvl w:val="0"/>
                 <w:numId w:val="13"/>
@@ -3906,7 +3971,7 @@
     </w:p>
     <w:tbl>
       <w:tblPr>
-        <w:tblStyle w:val="1024"/>
+        <w:tblStyle w:val="1030"/>
         <w:tblInd w:w="-714" w:type="dxa"/>
         <w:tblW w:w="9498" w:type="dxa"/>
         <w:tblBorders>
@@ -4010,7 +4075,7 @@
     </w:p>
     <w:tbl>
       <w:tblPr>
-        <w:tblStyle w:val="1025"/>
+        <w:tblStyle w:val="1031"/>
         <w:tblInd w:w="-714" w:type="dxa"/>
         <w:tblW w:w="9498" w:type="dxa"/>
         <w:tblBorders>
@@ -4429,6 +4494,12 @@
                 <w:szCs w:val="20"/>
               </w:rPr>
               <w:t xml:space="preserve">y Gestión de Requerimientos): Levantamiento y refinamiento de historias de usuario con los comerciantes clientes, diseño y ejecución de casos de prueba y elaboración de manuales de usuario.</w:t>
+            </w:r>
+            <w:r>
+              <w:rPr>
+                <w:sz w:val="20"/>
+                <w:szCs w:val="20"/>
+              </w:rPr>
             </w:r>
             <w:r>
               <w:rPr>
@@ -4575,7 +4646,7 @@
     </w:p>
     <w:tbl>
       <w:tblPr>
-        <w:tblStyle w:val="1026"/>
+        <w:tblStyle w:val="1032"/>
         <w:tblInd w:w="-714" w:type="dxa"/>
         <w:tblW w:w="9640" w:type="dxa"/>
         <w:tblBorders>
@@ -4679,7 +4750,7 @@
     </w:p>
     <w:tbl>
       <w:tblPr>
-        <w:tblStyle w:val="1027"/>
+        <w:tblStyle w:val="1033"/>
         <w:tblInd w:w="-714" w:type="dxa"/>
         <w:tblW w:w="10062" w:type="dxa"/>
         <w:tblBorders>
@@ -6691,7 +6762,7 @@
     </w:p>
     <w:tbl>
       <w:tblPr>
-        <w:tblStyle w:val="1028"/>
+        <w:tblStyle w:val="1034"/>
         <w:tblInd w:w="-714" w:type="dxa"/>
         <w:tblW w:w="9640" w:type="dxa"/>
         <w:tblBorders>
@@ -6795,7 +6866,7 @@
     </w:p>
     <w:tbl>
       <w:tblPr>
-        <w:tblStyle w:val="1029"/>
+        <w:tblStyle w:val="1035"/>
         <w:jc w:val="center"/>
         <w:tblInd w:w="0" w:type="dxa"/>
         <w:tblW w:w="11025" w:type="dxa"/>
@@ -10403,7 +10474,7 @@
     </w:p>
     <w:tbl>
       <w:tblPr>
-        <w:tblStyle w:val="1030"/>
+        <w:tblStyle w:val="1036"/>
         <w:tblInd w:w="-714" w:type="dxa"/>
         <w:tblW w:w="9640" w:type="dxa"/>
         <w:tblBorders>
@@ -10641,14 +10712,14 @@
             <w:hyperlink r:id="rId13" w:tooltip="https://docs.google.com/spreadsheets/d/1M7QbCdacNNejPZaqe_oz3CZndsZHIrK4XOt7Qx0Ovns/edit?usp=sharing" w:history="1">
               <w:r>
                 <w:rPr>
-                  <w:rStyle w:val="970"/>
+                  <w:rStyle w:val="976"/>
                   <w:lang w:val="es-ES"/>
                 </w:rPr>
                 <w:t xml:space="preserve">Gantt</w:t>
               </w:r>
               <w:r>
                 <w:rPr>
-                  <w:rStyle w:val="970"/>
+                  <w:rStyle w:val="976"/>
                 </w:rPr>
               </w:r>
             </w:hyperlink>
@@ -10769,7 +10840,7 @@
     <w:sdtContent>
       <w:p>
         <w:pPr>
-          <w:pStyle w:val="998"/>
+          <w:pStyle w:val="1004"/>
           <w:pBdr/>
           <w:spacing/>
           <w:ind/>
@@ -10800,7 +10871,7 @@
   </w:sdt>
   <w:p>
     <w:pPr>
-      <w:pStyle w:val="998"/>
+      <w:pStyle w:val="1004"/>
       <w:pBdr/>
       <w:spacing/>
       <w:ind/>
@@ -10919,7 +10990,7 @@
   </w:p>
   <w:tbl>
     <w:tblPr>
-      <w:tblStyle w:val="1031"/>
+      <w:tblStyle w:val="1037"/>
       <w:tblInd w:w="-709" w:type="dxa"/>
       <w:tblW w:w="9923" w:type="dxa"/>
       <w:tblBorders>
@@ -13208,9 +13279,9 @@
     <w:lsdException w:name="Bibliography" w:uiPriority="37"/>
     <w:lsdException w:name="TOC Heading" w:uiPriority="39" w:qFormat="1"/>
   </w:latentStyles>
-  <w:style w:type="table" w:styleId="812">
+  <w:style w:type="table" w:styleId="818">
     <w:name w:val="Table Grid Light"/>
-    <w:basedOn w:val="992"/>
+    <w:basedOn w:val="998"/>
     <w:uiPriority w:val="59"/>
     <w:pPr>
       <w:pBdr/>
@@ -13407,9 +13478,9 @@
       </w:tcPr>
     </w:tblStylePr>
   </w:style>
-  <w:style w:type="table" w:styleId="813">
+  <w:style w:type="table" w:styleId="819">
     <w:name w:val="Plain Table 1"/>
-    <w:basedOn w:val="992"/>
+    <w:basedOn w:val="998"/>
     <w:uiPriority w:val="59"/>
     <w:pPr>
       <w:pBdr/>
@@ -13632,9 +13703,9 @@
       </w:tcPr>
     </w:tblStylePr>
   </w:style>
-  <w:style w:type="table" w:styleId="814">
+  <w:style w:type="table" w:styleId="820">
     <w:name w:val="Plain Table 2"/>
-    <w:basedOn w:val="992"/>
+    <w:basedOn w:val="998"/>
     <w:uiPriority w:val="59"/>
     <w:pPr>
       <w:pBdr/>
@@ -13865,9 +13936,9 @@
       </w:tcPr>
     </w:tblStylePr>
   </w:style>
-  <w:style w:type="table" w:styleId="815">
+  <w:style w:type="table" w:styleId="821">
     <w:name w:val="Plain Table 3"/>
-    <w:basedOn w:val="992"/>
+    <w:basedOn w:val="998"/>
     <w:uiPriority w:val="99"/>
     <w:pPr>
       <w:pBdr/>
@@ -14095,9 +14166,9 @@
       </w:tcPr>
     </w:tblStylePr>
   </w:style>
-  <w:style w:type="table" w:styleId="816">
+  <w:style w:type="table" w:styleId="822">
     <w:name w:val="Plain Table 4"/>
-    <w:basedOn w:val="992"/>
+    <w:basedOn w:val="998"/>
     <w:uiPriority w:val="99"/>
     <w:pPr>
       <w:pBdr/>
@@ -14311,9 +14382,9 @@
       </w:tcPr>
     </w:tblStylePr>
   </w:style>
-  <w:style w:type="table" w:styleId="817">
+  <w:style w:type="table" w:styleId="823">
     <w:name w:val="Plain Table 5"/>
-    <w:basedOn w:val="992"/>
+    <w:basedOn w:val="998"/>
     <w:uiPriority w:val="99"/>
     <w:pPr>
       <w:pBdr/>
@@ -14544,9 +14615,9 @@
       </w:tcPr>
     </w:tblStylePr>
   </w:style>
-  <w:style w:type="table" w:styleId="818">
+  <w:style w:type="table" w:styleId="824">
     <w:name w:val="Grid Table 1 Light"/>
-    <w:basedOn w:val="992"/>
+    <w:basedOn w:val="998"/>
     <w:uiPriority w:val="99"/>
     <w:pPr>
       <w:pBdr/>
@@ -14767,9 +14838,9 @@
       </w:tcPr>
     </w:tblStylePr>
   </w:style>
-  <w:style w:type="table" w:styleId="819">
+  <w:style w:type="table" w:styleId="825">
     <w:name w:val="Grid Table 1 Light - Accent 1"/>
-    <w:basedOn w:val="992"/>
+    <w:basedOn w:val="998"/>
     <w:uiPriority w:val="99"/>
     <w:pPr>
       <w:pBdr/>
@@ -14990,9 +15061,9 @@
       </w:tcPr>
     </w:tblStylePr>
   </w:style>
-  <w:style w:type="table" w:styleId="820">
+  <w:style w:type="table" w:styleId="826">
     <w:name w:val="Grid Table 1 Light - Accent 2"/>
-    <w:basedOn w:val="992"/>
+    <w:basedOn w:val="998"/>
     <w:uiPriority w:val="99"/>
     <w:pPr>
       <w:pBdr/>
@@ -15213,9 +15284,9 @@
       </w:tcPr>
     </w:tblStylePr>
   </w:style>
-  <w:style w:type="table" w:styleId="821">
+  <w:style w:type="table" w:styleId="827">
     <w:name w:val="Grid Table 1 Light - Accent 3"/>
-    <w:basedOn w:val="992"/>
+    <w:basedOn w:val="998"/>
     <w:uiPriority w:val="99"/>
     <w:pPr>
       <w:pBdr/>
@@ -15436,9 +15507,9 @@
       </w:tcPr>
     </w:tblStylePr>
   </w:style>
-  <w:style w:type="table" w:styleId="822">
+  <w:style w:type="table" w:styleId="828">
     <w:name w:val="Grid Table 1 Light - Accent 4"/>
-    <w:basedOn w:val="992"/>
+    <w:basedOn w:val="998"/>
     <w:uiPriority w:val="99"/>
     <w:pPr>
       <w:pBdr/>
@@ -15659,9 +15730,9 @@
       </w:tcPr>
     </w:tblStylePr>
   </w:style>
-  <w:style w:type="table" w:styleId="823">
+  <w:style w:type="table" w:styleId="829">
     <w:name w:val="Grid Table 1 Light - Accent 5"/>
-    <w:basedOn w:val="992"/>
+    <w:basedOn w:val="998"/>
     <w:uiPriority w:val="99"/>
     <w:pPr>
       <w:pBdr/>
@@ -15882,9 +15953,9 @@
       </w:tcPr>
     </w:tblStylePr>
   </w:style>
-  <w:style w:type="table" w:styleId="824">
+  <w:style w:type="table" w:styleId="830">
     <w:name w:val="Grid Table 1 Light - Accent 6"/>
-    <w:basedOn w:val="992"/>
+    <w:basedOn w:val="998"/>
     <w:uiPriority w:val="99"/>
     <w:pPr>
       <w:pBdr/>
@@ -16105,9 +16176,9 @@
       </w:tcPr>
     </w:tblStylePr>
   </w:style>
-  <w:style w:type="table" w:styleId="825">
+  <w:style w:type="table" w:styleId="831">
     <w:name w:val="Grid Table 2"/>
-    <w:basedOn w:val="992"/>
+    <w:basedOn w:val="998"/>
     <w:uiPriority w:val="99"/>
     <w:pPr>
       <w:pBdr/>
@@ -16337,9 +16408,9 @@
       </w:tcPr>
     </w:tblStylePr>
   </w:style>
-  <w:style w:type="table" w:styleId="826">
+  <w:style w:type="table" w:styleId="832">
     <w:name w:val="Grid Table 2 - Accent 1"/>
-    <w:basedOn w:val="992"/>
+    <w:basedOn w:val="998"/>
     <w:uiPriority w:val="99"/>
     <w:pPr>
       <w:pBdr/>
@@ -16569,9 +16640,9 @@
       </w:tcPr>
     </w:tblStylePr>
   </w:style>
-  <w:style w:type="table" w:styleId="827">
+  <w:style w:type="table" w:styleId="833">
     <w:name w:val="Grid Table 2 - Accent 2"/>
-    <w:basedOn w:val="992"/>
+    <w:basedOn w:val="998"/>
     <w:uiPriority w:val="99"/>
     <w:pPr>
       <w:pBdr/>
@@ -16801,9 +16872,9 @@
       </w:tcPr>
     </w:tblStylePr>
   </w:style>
-  <w:style w:type="table" w:styleId="828">
+  <w:style w:type="table" w:styleId="834">
     <w:name w:val="Grid Table 2 - Accent 3"/>
-    <w:basedOn w:val="992"/>
+    <w:basedOn w:val="998"/>
     <w:uiPriority w:val="99"/>
     <w:pPr>
       <w:pBdr/>
@@ -17033,9 +17104,9 @@
       </w:tcPr>
     </w:tblStylePr>
   </w:style>
-  <w:style w:type="table" w:styleId="829">
+  <w:style w:type="table" w:styleId="835">
     <w:name w:val="Grid Table 2 - Accent 4"/>
-    <w:basedOn w:val="992"/>
+    <w:basedOn w:val="998"/>
     <w:uiPriority w:val="99"/>
     <w:pPr>
       <w:pBdr/>
@@ -17265,9 +17336,9 @@
       </w:tcPr>
     </w:tblStylePr>
   </w:style>
-  <w:style w:type="table" w:styleId="830">
+  <w:style w:type="table" w:styleId="836">
     <w:name w:val="Grid Table 2 - Accent 5"/>
-    <w:basedOn w:val="992"/>
+    <w:basedOn w:val="998"/>
     <w:uiPriority w:val="99"/>
     <w:pPr>
       <w:pBdr/>
@@ -17497,9 +17568,9 @@
       </w:tcPr>
     </w:tblStylePr>
   </w:style>
-  <w:style w:type="table" w:styleId="831">
+  <w:style w:type="table" w:styleId="837">
     <w:name w:val="Grid Table 2 - Accent 6"/>
-    <w:basedOn w:val="992"/>
+    <w:basedOn w:val="998"/>
     <w:uiPriority w:val="99"/>
     <w:pPr>
       <w:pBdr/>
@@ -17729,9 +17800,9 @@
       </w:tcPr>
     </w:tblStylePr>
   </w:style>
-  <w:style w:type="table" w:styleId="832">
+  <w:style w:type="table" w:styleId="838">
     <w:name w:val="Grid Table 3"/>
-    <w:basedOn w:val="992"/>
+    <w:basedOn w:val="998"/>
     <w:uiPriority w:val="99"/>
     <w:pPr>
       <w:pBdr/>
@@ -17974,9 +18045,9 @@
       </w:tcPr>
     </w:tblStylePr>
   </w:style>
-  <w:style w:type="table" w:styleId="833">
+  <w:style w:type="table" w:styleId="839">
     <w:name w:val="Grid Table 3 - Accent 1"/>
-    <w:basedOn w:val="992"/>
+    <w:basedOn w:val="998"/>
     <w:uiPriority w:val="99"/>
     <w:pPr>
       <w:pBdr/>
@@ -18219,9 +18290,9 @@
       </w:tcPr>
     </w:tblStylePr>
   </w:style>
-  <w:style w:type="table" w:styleId="834">
+  <w:style w:type="table" w:styleId="840">
     <w:name w:val="Grid Table 3 - Accent 2"/>
-    <w:basedOn w:val="992"/>
+    <w:basedOn w:val="998"/>
     <w:uiPriority w:val="99"/>
     <w:pPr>
       <w:pBdr/>
@@ -18464,9 +18535,9 @@
       </w:tcPr>
     </w:tblStylePr>
   </w:style>
-  <w:style w:type="table" w:styleId="835">
+  <w:style w:type="table" w:styleId="841">
     <w:name w:val="Grid Table 3 - Accent 3"/>
-    <w:basedOn w:val="992"/>
+    <w:basedOn w:val="998"/>
     <w:uiPriority w:val="99"/>
     <w:pPr>
       <w:pBdr/>
@@ -18709,9 +18780,9 @@
       </w:tcPr>
     </w:tblStylePr>
   </w:style>
-  <w:style w:type="table" w:styleId="836">
+  <w:style w:type="table" w:styleId="842">
     <w:name w:val="Grid Table 3 - Accent 4"/>
-    <w:basedOn w:val="992"/>
+    <w:basedOn w:val="998"/>
     <w:uiPriority w:val="99"/>
     <w:pPr>
       <w:pBdr/>
@@ -18954,9 +19025,9 @@
       </w:tcPr>
     </w:tblStylePr>
   </w:style>
-  <w:style w:type="table" w:styleId="837">
+  <w:style w:type="table" w:styleId="843">
     <w:name w:val="Grid Table 3 - Accent 5"/>
-    <w:basedOn w:val="992"/>
+    <w:basedOn w:val="998"/>
     <w:uiPriority w:val="99"/>
     <w:pPr>
       <w:pBdr/>
@@ -19199,9 +19270,9 @@
       </w:tcPr>
     </w:tblStylePr>
   </w:style>
-  <w:style w:type="table" w:styleId="838">
+  <w:style w:type="table" w:styleId="844">
     <w:name w:val="Grid Table 3 - Accent 6"/>
-    <w:basedOn w:val="992"/>
+    <w:basedOn w:val="998"/>
     <w:uiPriority w:val="99"/>
     <w:pPr>
       <w:pBdr/>
@@ -19444,9 +19515,9 @@
       </w:tcPr>
     </w:tblStylePr>
   </w:style>
-  <w:style w:type="table" w:styleId="839">
+  <w:style w:type="table" w:styleId="845">
     <w:name w:val="Grid Table 4"/>
-    <w:basedOn w:val="992"/>
+    <w:basedOn w:val="998"/>
     <w:uiPriority w:val="59"/>
     <w:pPr>
       <w:pBdr/>
@@ -19677,9 +19748,9 @@
       </w:tcPr>
     </w:tblStylePr>
   </w:style>
-  <w:style w:type="table" w:styleId="840">
+  <w:style w:type="table" w:styleId="846">
     <w:name w:val="Grid Table 4 - Accent 1"/>
-    <w:basedOn w:val="992"/>
+    <w:basedOn w:val="998"/>
     <w:uiPriority w:val="59"/>
     <w:pPr>
       <w:pBdr/>
@@ -19910,9 +19981,9 @@
       </w:tcPr>
     </w:tblStylePr>
   </w:style>
-  <w:style w:type="table" w:styleId="841">
+  <w:style w:type="table" w:styleId="847">
     <w:name w:val="Grid Table 4 - Accent 2"/>
-    <w:basedOn w:val="992"/>
+    <w:basedOn w:val="998"/>
     <w:uiPriority w:val="59"/>
     <w:pPr>
       <w:pBdr/>
@@ -20143,9 +20214,9 @@
       </w:tcPr>
     </w:tblStylePr>
   </w:style>
-  <w:style w:type="table" w:styleId="842">
+  <w:style w:type="table" w:styleId="848">
     <w:name w:val="Grid Table 4 - Accent 3"/>
-    <w:basedOn w:val="992"/>
+    <w:basedOn w:val="998"/>
     <w:uiPriority w:val="59"/>
     <w:pPr>
       <w:pBdr/>
@@ -20376,9 +20447,9 @@
       </w:tcPr>
     </w:tblStylePr>
   </w:style>
-  <w:style w:type="table" w:styleId="843">
+  <w:style w:type="table" w:styleId="849">
     <w:name w:val="Grid Table 4 - Accent 4"/>
-    <w:basedOn w:val="992"/>
+    <w:basedOn w:val="998"/>
     <w:uiPriority w:val="59"/>
     <w:pPr>
       <w:pBdr/>
@@ -20609,9 +20680,9 @@
       </w:tcPr>
     </w:tblStylePr>
   </w:style>
-  <w:style w:type="table" w:styleId="844">
+  <w:style w:type="table" w:styleId="850">
     <w:name w:val="Grid Table 4 - Accent 5"/>
-    <w:basedOn w:val="992"/>
+    <w:basedOn w:val="998"/>
     <w:uiPriority w:val="59"/>
     <w:pPr>
       <w:pBdr/>
@@ -20842,9 +20913,9 @@
       </w:tcPr>
     </w:tblStylePr>
   </w:style>
-  <w:style w:type="table" w:styleId="845">
+  <w:style w:type="table" w:styleId="851">
     <w:name w:val="Grid Table 4 - Accent 6"/>
-    <w:basedOn w:val="992"/>
+    <w:basedOn w:val="998"/>
     <w:uiPriority w:val="59"/>
     <w:pPr>
       <w:pBdr/>
@@ -21075,9 +21146,9 @@
       </w:tcPr>
     </w:tblStylePr>
   </w:style>
-  <w:style w:type="table" w:styleId="846">
+  <w:style w:type="table" w:styleId="852">
     <w:name w:val="Grid Table 5 Dark"/>
-    <w:basedOn w:val="992"/>
+    <w:basedOn w:val="998"/>
     <w:uiPriority w:val="99"/>
     <w:pPr>
       <w:pBdr/>
@@ -21303,9 +21374,9 @@
       </w:tcPr>
     </w:tblStylePr>
   </w:style>
-  <w:style w:type="table" w:styleId="847">
+  <w:style w:type="table" w:styleId="853">
     <w:name w:val="Grid Table 5 Dark- Accent 1"/>
-    <w:basedOn w:val="992"/>
+    <w:basedOn w:val="998"/>
     <w:uiPriority w:val="99"/>
     <w:pPr>
       <w:pBdr/>
@@ -21531,9 +21602,9 @@
       </w:tcPr>
     </w:tblStylePr>
   </w:style>
-  <w:style w:type="table" w:styleId="848">
+  <w:style w:type="table" w:styleId="854">
     <w:name w:val="Grid Table 5 Dark - Accent 2"/>
-    <w:basedOn w:val="992"/>
+    <w:basedOn w:val="998"/>
     <w:uiPriority w:val="99"/>
     <w:pPr>
       <w:pBdr/>
@@ -21759,9 +21830,9 @@
       </w:tcPr>
     </w:tblStylePr>
   </w:style>
-  <w:style w:type="table" w:styleId="849">
+  <w:style w:type="table" w:styleId="855">
     <w:name w:val="Grid Table 5 Dark - Accent 3"/>
-    <w:basedOn w:val="992"/>
+    <w:basedOn w:val="998"/>
     <w:uiPriority w:val="99"/>
     <w:pPr>
       <w:pBdr/>
@@ -21987,9 +22058,9 @@
       </w:tcPr>
     </w:tblStylePr>
   </w:style>
-  <w:style w:type="table" w:styleId="850">
+  <w:style w:type="table" w:styleId="856">
     <w:name w:val="Grid Table 5 Dark- Accent 4"/>
-    <w:basedOn w:val="992"/>
+    <w:basedOn w:val="998"/>
     <w:uiPriority w:val="99"/>
     <w:pPr>
       <w:pBdr/>
@@ -22215,9 +22286,9 @@
       </w:tcPr>
     </w:tblStylePr>
   </w:style>
-  <w:style w:type="table" w:styleId="851">
+  <w:style w:type="table" w:styleId="857">
     <w:name w:val="Grid Table 5 Dark - Accent 5"/>
-    <w:basedOn w:val="992"/>
+    <w:basedOn w:val="998"/>
     <w:uiPriority w:val="99"/>
     <w:pPr>
       <w:pBdr/>
@@ -22443,9 +22514,9 @@
       </w:tcPr>
     </w:tblStylePr>
   </w:style>
-  <w:style w:type="table" w:styleId="852">
+  <w:style w:type="table" w:styleId="858">
     <w:name w:val="Grid Table 5 Dark - Accent 6"/>
-    <w:basedOn w:val="992"/>
+    <w:basedOn w:val="998"/>
     <w:uiPriority w:val="99"/>
     <w:pPr>
       <w:pBdr/>
@@ -22671,9 +22742,9 @@
       </w:tcPr>
     </w:tblStylePr>
   </w:style>
-  <w:style w:type="table" w:styleId="853">
+  <w:style w:type="table" w:styleId="859">
     <w:name w:val="Grid Table 6 Colorful"/>
-    <w:basedOn w:val="992"/>
+    <w:basedOn w:val="998"/>
     <w:uiPriority w:val="99"/>
     <w:pPr>
       <w:pBdr/>
@@ -22901,9 +22972,9 @@
       </w:tcPr>
     </w:tblStylePr>
   </w:style>
-  <w:style w:type="table" w:styleId="854">
+  <w:style w:type="table" w:styleId="860">
     <w:name w:val="Grid Table 6 Colorful - Accent 1"/>
-    <w:basedOn w:val="992"/>
+    <w:basedOn w:val="998"/>
     <w:uiPriority w:val="99"/>
     <w:pPr>
       <w:pBdr/>
@@ -23131,9 +23202,9 @@
       </w:tcPr>
     </w:tblStylePr>
   </w:style>
-  <w:style w:type="table" w:styleId="855">
+  <w:style w:type="table" w:styleId="861">
     <w:name w:val="Grid Table 6 Colorful - Accent 2"/>
-    <w:basedOn w:val="992"/>
+    <w:basedOn w:val="998"/>
     <w:uiPriority w:val="99"/>
     <w:pPr>
       <w:pBdr/>
@@ -23361,9 +23432,9 @@
       </w:tcPr>
     </w:tblStylePr>
   </w:style>
-  <w:style w:type="table" w:styleId="856">
+  <w:style w:type="table" w:styleId="862">
     <w:name w:val="Grid Table 6 Colorful - Accent 3"/>
-    <w:basedOn w:val="992"/>
+    <w:basedOn w:val="998"/>
     <w:uiPriority w:val="99"/>
     <w:pPr>
       <w:pBdr/>
@@ -23591,9 +23662,9 @@
       </w:tcPr>
     </w:tblStylePr>
   </w:style>
-  <w:style w:type="table" w:styleId="857">
+  <w:style w:type="table" w:styleId="863">
     <w:name w:val="Grid Table 6 Colorful - Accent 4"/>
-    <w:basedOn w:val="992"/>
+    <w:basedOn w:val="998"/>
     <w:uiPriority w:val="99"/>
     <w:pPr>
       <w:pBdr/>
@@ -23821,9 +23892,9 @@
       </w:tcPr>
     </w:tblStylePr>
   </w:style>
-  <w:style w:type="table" w:styleId="858">
+  <w:style w:type="table" w:styleId="864">
     <w:name w:val="Grid Table 6 Colorful - Accent 5"/>
-    <w:basedOn w:val="992"/>
+    <w:basedOn w:val="998"/>
     <w:uiPriority w:val="99"/>
     <w:pPr>
       <w:pBdr/>
@@ -24051,9 +24122,9 @@
       </w:tcPr>
     </w:tblStylePr>
   </w:style>
-  <w:style w:type="table" w:styleId="859">
+  <w:style w:type="table" w:styleId="865">
     <w:name w:val="Grid Table 6 Colorful - Accent 6"/>
-    <w:basedOn w:val="992"/>
+    <w:basedOn w:val="998"/>
     <w:uiPriority w:val="99"/>
     <w:pPr>
       <w:pBdr/>
@@ -24281,9 +24352,9 @@
       </w:tcPr>
     </w:tblStylePr>
   </w:style>
-  <w:style w:type="table" w:styleId="860">
+  <w:style w:type="table" w:styleId="866">
     <w:name w:val="Grid Table 7 Colorful"/>
-    <w:basedOn w:val="992"/>
+    <w:basedOn w:val="998"/>
     <w:uiPriority w:val="99"/>
     <w:pPr>
       <w:pBdr/>
@@ -24535,9 +24606,9 @@
       </w:tcPr>
     </w:tblStylePr>
   </w:style>
-  <w:style w:type="table" w:styleId="861">
+  <w:style w:type="table" w:styleId="867">
     <w:name w:val="Grid Table 7 Colorful - Accent 1"/>
-    <w:basedOn w:val="992"/>
+    <w:basedOn w:val="998"/>
     <w:uiPriority w:val="99"/>
     <w:pPr>
       <w:pBdr/>
@@ -24789,9 +24860,9 @@
       </w:tcPr>
     </w:tblStylePr>
   </w:style>
-  <w:style w:type="table" w:styleId="862">
+  <w:style w:type="table" w:styleId="868">
     <w:name w:val="Grid Table 7 Colorful - Accent 2"/>
-    <w:basedOn w:val="992"/>
+    <w:basedOn w:val="998"/>
     <w:uiPriority w:val="99"/>
     <w:pPr>
       <w:pBdr/>
@@ -25043,9 +25114,9 @@
       </w:tcPr>
     </w:tblStylePr>
   </w:style>
-  <w:style w:type="table" w:styleId="863">
+  <w:style w:type="table" w:styleId="869">
     <w:name w:val="Grid Table 7 Colorful - Accent 3"/>
-    <w:basedOn w:val="992"/>
+    <w:basedOn w:val="998"/>
     <w:uiPriority w:val="99"/>
     <w:pPr>
       <w:pBdr/>
@@ -25297,9 +25368,9 @@
       </w:tcPr>
     </w:tblStylePr>
   </w:style>
-  <w:style w:type="table" w:styleId="864">
+  <w:style w:type="table" w:styleId="870">
     <w:name w:val="Grid Table 7 Colorful - Accent 4"/>
-    <w:basedOn w:val="992"/>
+    <w:basedOn w:val="998"/>
     <w:uiPriority w:val="99"/>
     <w:pPr>
       <w:pBdr/>
@@ -25551,9 +25622,9 @@
       </w:tcPr>
     </w:tblStylePr>
   </w:style>
-  <w:style w:type="table" w:styleId="865">
+  <w:style w:type="table" w:styleId="871">
     <w:name w:val="Grid Table 7 Colorful - Accent 5"/>
-    <w:basedOn w:val="992"/>
+    <w:basedOn w:val="998"/>
     <w:uiPriority w:val="99"/>
     <w:pPr>
       <w:pBdr/>
@@ -25805,9 +25876,9 @@
       </w:tcPr>
     </w:tblStylePr>
   </w:style>
-  <w:style w:type="table" w:styleId="866">
+  <w:style w:type="table" w:styleId="872">
     <w:name w:val="Grid Table 7 Colorful - Accent 6"/>
-    <w:basedOn w:val="992"/>
+    <w:basedOn w:val="998"/>
     <w:uiPriority w:val="99"/>
     <w:pPr>
       <w:pBdr/>
@@ -26059,9 +26130,9 @@
       </w:tcPr>
     </w:tblStylePr>
   </w:style>
-  <w:style w:type="table" w:styleId="867">
+  <w:style w:type="table" w:styleId="873">
     <w:name w:val="List Table 1 Light"/>
-    <w:basedOn w:val="992"/>
+    <w:basedOn w:val="998"/>
     <w:uiPriority w:val="99"/>
     <w:pPr>
       <w:pBdr/>
@@ -26275,9 +26346,9 @@
       </w:tcPr>
     </w:tblStylePr>
   </w:style>
-  <w:style w:type="table" w:styleId="868">
+  <w:style w:type="table" w:styleId="874">
     <w:name w:val="List Table 1 Light - Accent 1"/>
-    <w:basedOn w:val="992"/>
+    <w:basedOn w:val="998"/>
     <w:uiPriority w:val="99"/>
     <w:pPr>
       <w:pBdr/>
@@ -26491,9 +26562,9 @@
       </w:tcPr>
     </w:tblStylePr>
   </w:style>
-  <w:style w:type="table" w:styleId="869">
+  <w:style w:type="table" w:styleId="875">
     <w:name w:val="List Table 1 Light - Accent 2"/>
-    <w:basedOn w:val="992"/>
+    <w:basedOn w:val="998"/>
     <w:uiPriority w:val="99"/>
     <w:pPr>
       <w:pBdr/>
@@ -26707,9 +26778,9 @@
       </w:tcPr>
     </w:tblStylePr>
   </w:style>
-  <w:style w:type="table" w:styleId="870">
+  <w:style w:type="table" w:styleId="876">
     <w:name w:val="List Table 1 Light - Accent 3"/>
-    <w:basedOn w:val="992"/>
+    <w:basedOn w:val="998"/>
     <w:uiPriority w:val="99"/>
     <w:pPr>
       <w:pBdr/>
@@ -26923,9 +26994,9 @@
       </w:tcPr>
     </w:tblStylePr>
   </w:style>
-  <w:style w:type="table" w:styleId="871">
+  <w:style w:type="table" w:styleId="877">
     <w:name w:val="List Table 1 Light - Accent 4"/>
-    <w:basedOn w:val="992"/>
+    <w:basedOn w:val="998"/>
     <w:uiPriority w:val="99"/>
     <w:pPr>
       <w:pBdr/>
@@ -27139,9 +27210,9 @@
       </w:tcPr>
     </w:tblStylePr>
   </w:style>
-  <w:style w:type="table" w:styleId="872">
+  <w:style w:type="table" w:styleId="878">
     <w:name w:val="List Table 1 Light - Accent 5"/>
-    <w:basedOn w:val="992"/>
+    <w:basedOn w:val="998"/>
     <w:uiPriority w:val="99"/>
     <w:pPr>
       <w:pBdr/>
@@ -27355,9 +27426,9 @@
       </w:tcPr>
     </w:tblStylePr>
   </w:style>
-  <w:style w:type="table" w:styleId="873">
+  <w:style w:type="table" w:styleId="879">
     <w:name w:val="List Table 1 Light - Accent 6"/>
-    <w:basedOn w:val="992"/>
+    <w:basedOn w:val="998"/>
     <w:uiPriority w:val="99"/>
     <w:pPr>
       <w:pBdr/>
@@ -27571,9 +27642,9 @@
       </w:tcPr>
     </w:tblStylePr>
   </w:style>
-  <w:style w:type="table" w:styleId="874">
+  <w:style w:type="table" w:styleId="880">
     <w:name w:val="List Table 2"/>
-    <w:basedOn w:val="992"/>
+    <w:basedOn w:val="998"/>
     <w:uiPriority w:val="99"/>
     <w:pPr>
       <w:pBdr/>
@@ -27809,9 +27880,9 @@
       </w:tcPr>
     </w:tblStylePr>
   </w:style>
-  <w:style w:type="table" w:styleId="875">
+  <w:style w:type="table" w:styleId="881">
     <w:name w:val="List Table 2 - Accent 1"/>
-    <w:basedOn w:val="992"/>
+    <w:basedOn w:val="998"/>
     <w:uiPriority w:val="99"/>
     <w:pPr>
       <w:pBdr/>
@@ -28047,9 +28118,9 @@
       </w:tcPr>
     </w:tblStylePr>
   </w:style>
-  <w:style w:type="table" w:styleId="876">
+  <w:style w:type="table" w:styleId="882">
     <w:name w:val="List Table 2 - Accent 2"/>
-    <w:basedOn w:val="992"/>
+    <w:basedOn w:val="998"/>
     <w:uiPriority w:val="99"/>
     <w:pPr>
       <w:pBdr/>
@@ -28285,9 +28356,9 @@
       </w:tcPr>
     </w:tblStylePr>
   </w:style>
-  <w:style w:type="table" w:styleId="877">
+  <w:style w:type="table" w:styleId="883">
     <w:name w:val="List Table 2 - Accent 3"/>
-    <w:basedOn w:val="992"/>
+    <w:basedOn w:val="998"/>
     <w:uiPriority w:val="99"/>
     <w:pPr>
       <w:pBdr/>
@@ -28523,9 +28594,9 @@
       </w:tcPr>
     </w:tblStylePr>
   </w:style>
-  <w:style w:type="table" w:styleId="878">
+  <w:style w:type="table" w:styleId="884">
     <w:name w:val="List Table 2 - Accent 4"/>
-    <w:basedOn w:val="992"/>
+    <w:basedOn w:val="998"/>
     <w:uiPriority w:val="99"/>
     <w:pPr>
       <w:pBdr/>
@@ -28761,9 +28832,9 @@
       </w:tcPr>
     </w:tblStylePr>
   </w:style>
-  <w:style w:type="table" w:styleId="879">
+  <w:style w:type="table" w:styleId="885">
     <w:name w:val="List Table 2 - Accent 5"/>
-    <w:basedOn w:val="992"/>
+    <w:basedOn w:val="998"/>
     <w:uiPriority w:val="99"/>
     <w:pPr>
       <w:pBdr/>
@@ -28999,9 +29070,9 @@
       </w:tcPr>
     </w:tblStylePr>
   </w:style>
-  <w:style w:type="table" w:styleId="880">
+  <w:style w:type="table" w:styleId="886">
     <w:name w:val="List Table 2 - Accent 6"/>
-    <w:basedOn w:val="992"/>
+    <w:basedOn w:val="998"/>
     <w:uiPriority w:val="99"/>
     <w:pPr>
       <w:pBdr/>
@@ -29237,9 +29308,9 @@
       </w:tcPr>
     </w:tblStylePr>
   </w:style>
-  <w:style w:type="table" w:styleId="881">
+  <w:style w:type="table" w:styleId="887">
     <w:name w:val="List Table 3"/>
-    <w:basedOn w:val="992"/>
+    <w:basedOn w:val="998"/>
     <w:uiPriority w:val="99"/>
     <w:pPr>
       <w:pBdr/>
@@ -29465,9 +29536,9 @@
       </w:tcPr>
     </w:tblStylePr>
   </w:style>
-  <w:style w:type="table" w:styleId="882">
+  <w:style w:type="table" w:styleId="888">
     <w:name w:val="List Table 3 - Accent 1"/>
-    <w:basedOn w:val="992"/>
+    <w:basedOn w:val="998"/>
     <w:uiPriority w:val="99"/>
     <w:pPr>
       <w:pBdr/>
@@ -29693,9 +29764,9 @@
       </w:tcPr>
     </w:tblStylePr>
   </w:style>
-  <w:style w:type="table" w:styleId="883">
+  <w:style w:type="table" w:styleId="889">
     <w:name w:val="List Table 3 - Accent 2"/>
-    <w:basedOn w:val="992"/>
+    <w:basedOn w:val="998"/>
     <w:uiPriority w:val="99"/>
     <w:pPr>
       <w:pBdr/>
@@ -29921,9 +29992,9 @@
       </w:tcPr>
     </w:tblStylePr>
   </w:style>
-  <w:style w:type="table" w:styleId="884">
+  <w:style w:type="table" w:styleId="890">
     <w:name w:val="List Table 3 - Accent 3"/>
-    <w:basedOn w:val="992"/>
+    <w:basedOn w:val="998"/>
     <w:uiPriority w:val="99"/>
     <w:pPr>
       <w:pBdr/>
@@ -30149,9 +30220,9 @@
       </w:tcPr>
     </w:tblStylePr>
   </w:style>
-  <w:style w:type="table" w:styleId="885">
+  <w:style w:type="table" w:styleId="891">
     <w:name w:val="List Table 3 - Accent 4"/>
-    <w:basedOn w:val="992"/>
+    <w:basedOn w:val="998"/>
     <w:uiPriority w:val="99"/>
     <w:pPr>
       <w:pBdr/>
@@ -30377,9 +30448,9 @@
       </w:tcPr>
     </w:tblStylePr>
   </w:style>
-  <w:style w:type="table" w:styleId="886">
+  <w:style w:type="table" w:styleId="892">
     <w:name w:val="List Table 3 - Accent 5"/>
-    <w:basedOn w:val="992"/>
+    <w:basedOn w:val="998"/>
     <w:uiPriority w:val="99"/>
     <w:pPr>
       <w:pBdr/>
@@ -30605,9 +30676,9 @@
       </w:tcPr>
     </w:tblStylePr>
   </w:style>
-  <w:style w:type="table" w:styleId="887">
+  <w:style w:type="table" w:styleId="893">
     <w:name w:val="List Table 3 - Accent 6"/>
-    <w:basedOn w:val="992"/>
+    <w:basedOn w:val="998"/>
     <w:uiPriority w:val="99"/>
     <w:pPr>
       <w:pBdr/>
@@ -30833,9 +30904,9 @@
       </w:tcPr>
     </w:tblStylePr>
   </w:style>
-  <w:style w:type="table" w:styleId="888">
+  <w:style w:type="table" w:styleId="894">
     <w:name w:val="List Table 4"/>
-    <w:basedOn w:val="992"/>
+    <w:basedOn w:val="998"/>
     <w:uiPriority w:val="99"/>
     <w:pPr>
       <w:pBdr/>
@@ -31058,9 +31129,9 @@
       </w:tcPr>
     </w:tblStylePr>
   </w:style>
-  <w:style w:type="table" w:styleId="889">
+  <w:style w:type="table" w:styleId="895">
     <w:name w:val="List Table 4 - Accent 1"/>
-    <w:basedOn w:val="992"/>
+    <w:basedOn w:val="998"/>
     <w:uiPriority w:val="99"/>
     <w:pPr>
       <w:pBdr/>
@@ -31283,9 +31354,9 @@
       </w:tcPr>
     </w:tblStylePr>
   </w:style>
-  <w:style w:type="table" w:styleId="890">
+  <w:style w:type="table" w:styleId="896">
     <w:name w:val="List Table 4 - Accent 2"/>
-    <w:basedOn w:val="992"/>
+    <w:basedOn w:val="998"/>
     <w:uiPriority w:val="99"/>
     <w:pPr>
       <w:pBdr/>
@@ -31508,9 +31579,9 @@
       </w:tcPr>
     </w:tblStylePr>
   </w:style>
-  <w:style w:type="table" w:styleId="891">
+  <w:style w:type="table" w:styleId="897">
     <w:name w:val="List Table 4 - Accent 3"/>
-    <w:basedOn w:val="992"/>
+    <w:basedOn w:val="998"/>
     <w:uiPriority w:val="99"/>
     <w:pPr>
       <w:pBdr/>
@@ -31733,9 +31804,9 @@
       </w:tcPr>
     </w:tblStylePr>
   </w:style>
-  <w:style w:type="table" w:styleId="892">
+  <w:style w:type="table" w:styleId="898">
     <w:name w:val="List Table 4 - Accent 4"/>
-    <w:basedOn w:val="992"/>
+    <w:basedOn w:val="998"/>
     <w:uiPriority w:val="99"/>
     <w:pPr>
       <w:pBdr/>
@@ -31958,9 +32029,9 @@
       </w:tcPr>
     </w:tblStylePr>
   </w:style>
-  <w:style w:type="table" w:styleId="893">
+  <w:style w:type="table" w:styleId="899">
     <w:name w:val="List Table 4 - Accent 5"/>
-    <w:basedOn w:val="992"/>
+    <w:basedOn w:val="998"/>
     <w:uiPriority w:val="99"/>
     <w:pPr>
       <w:pBdr/>
@@ -32183,9 +32254,9 @@
       </w:tcPr>
     </w:tblStylePr>
   </w:style>
-  <w:style w:type="table" w:styleId="894">
+  <w:style w:type="table" w:styleId="900">
     <w:name w:val="List Table 4 - Accent 6"/>
-    <w:basedOn w:val="992"/>
+    <w:basedOn w:val="998"/>
     <w:uiPriority w:val="99"/>
     <w:pPr>
       <w:pBdr/>
@@ -32408,9 +32479,9 @@
       </w:tcPr>
     </w:tblStylePr>
   </w:style>
-  <w:style w:type="table" w:styleId="895">
+  <w:style w:type="table" w:styleId="901">
     <w:name w:val="List Table 5 Dark"/>
-    <w:basedOn w:val="992"/>
+    <w:basedOn w:val="998"/>
     <w:uiPriority w:val="99"/>
     <w:pPr>
       <w:pBdr/>
@@ -32650,9 +32721,9 @@
       </w:tcPr>
     </w:tblStylePr>
   </w:style>
-  <w:style w:type="table" w:styleId="896">
+  <w:style w:type="table" w:styleId="902">
     <w:name w:val="List Table 5 Dark - Accent 1"/>
-    <w:basedOn w:val="992"/>
+    <w:basedOn w:val="998"/>
     <w:uiPriority w:val="99"/>
     <w:pPr>
       <w:pBdr/>
@@ -32892,9 +32963,9 @@
       </w:tcPr>
     </w:tblStylePr>
   </w:style>
-  <w:style w:type="table" w:styleId="897">
+  <w:style w:type="table" w:styleId="903">
     <w:name w:val="List Table 5 Dark - Accent 2"/>
-    <w:basedOn w:val="992"/>
+    <w:basedOn w:val="998"/>
     <w:uiPriority w:val="99"/>
     <w:pPr>
       <w:pBdr/>
@@ -33134,9 +33205,9 @@
       </w:tcPr>
     </w:tblStylePr>
   </w:style>
-  <w:style w:type="table" w:styleId="898">
+  <w:style w:type="table" w:styleId="904">
     <w:name w:val="List Table 5 Dark - Accent 3"/>
-    <w:basedOn w:val="992"/>
+    <w:basedOn w:val="998"/>
     <w:uiPriority w:val="99"/>
     <w:pPr>
       <w:pBdr/>
@@ -33376,9 +33447,9 @@
       </w:tcPr>
     </w:tblStylePr>
   </w:style>
-  <w:style w:type="table" w:styleId="899">
+  <w:style w:type="table" w:styleId="905">
     <w:name w:val="List Table 5 Dark - Accent 4"/>
-    <w:basedOn w:val="992"/>
+    <w:basedOn w:val="998"/>
     <w:uiPriority w:val="99"/>
     <w:pPr>
       <w:pBdr/>
@@ -33618,9 +33689,9 @@
       </w:tcPr>
     </w:tblStylePr>
   </w:style>
-  <w:style w:type="table" w:styleId="900">
+  <w:style w:type="table" w:styleId="906">
     <w:name w:val="List Table 5 Dark - Accent 5"/>
-    <w:basedOn w:val="992"/>
+    <w:basedOn w:val="998"/>
     <w:uiPriority w:val="99"/>
     <w:pPr>
       <w:pBdr/>
@@ -33860,9 +33931,9 @@
       </w:tcPr>
     </w:tblStylePr>
   </w:style>
-  <w:style w:type="table" w:styleId="901">
+  <w:style w:type="table" w:styleId="907">
     <w:name w:val="List Table 5 Dark - Accent 6"/>
-    <w:basedOn w:val="992"/>
+    <w:basedOn w:val="998"/>
     <w:uiPriority w:val="99"/>
     <w:pPr>
       <w:pBdr/>
@@ -34102,9 +34173,9 @@
       </w:tcPr>
     </w:tblStylePr>
   </w:style>
-  <w:style w:type="table" w:styleId="902">
+  <w:style w:type="table" w:styleId="908">
     <w:name w:val="List Table 6 Colorful"/>
-    <w:basedOn w:val="992"/>
+    <w:basedOn w:val="998"/>
     <w:uiPriority w:val="99"/>
     <w:pPr>
       <w:pBdr/>
@@ -34325,9 +34396,9 @@
       </w:tcPr>
     </w:tblStylePr>
   </w:style>
-  <w:style w:type="table" w:styleId="903">
+  <w:style w:type="table" w:styleId="909">
     <w:name w:val="List Table 6 Colorful - Accent 1"/>
-    <w:basedOn w:val="992"/>
+    <w:basedOn w:val="998"/>
     <w:uiPriority w:val="99"/>
     <w:pPr>
       <w:pBdr/>
@@ -34548,9 +34619,9 @@
       </w:tcPr>
     </w:tblStylePr>
   </w:style>
-  <w:style w:type="table" w:styleId="904">
+  <w:style w:type="table" w:styleId="910">
     <w:name w:val="List Table 6 Colorful - Accent 2"/>
-    <w:basedOn w:val="992"/>
+    <w:basedOn w:val="998"/>
     <w:uiPriority w:val="99"/>
     <w:pPr>
       <w:pBdr/>
@@ -34771,9 +34842,9 @@
       </w:tcPr>
     </w:tblStylePr>
   </w:style>
-  <w:style w:type="table" w:styleId="905">
+  <w:style w:type="table" w:styleId="911">
     <w:name w:val="List Table 6 Colorful - Accent 3"/>
-    <w:basedOn w:val="992"/>
+    <w:basedOn w:val="998"/>
     <w:uiPriority w:val="99"/>
     <w:pPr>
       <w:pBdr/>
@@ -34994,9 +35065,9 @@
       </w:tcPr>
     </w:tblStylePr>
   </w:style>
-  <w:style w:type="table" w:styleId="906">
+  <w:style w:type="table" w:styleId="912">
     <w:name w:val="List Table 6 Colorful - Accent 4"/>
-    <w:basedOn w:val="992"/>
+    <w:basedOn w:val="998"/>
     <w:uiPriority w:val="99"/>
     <w:pPr>
       <w:pBdr/>
@@ -35217,9 +35288,9 @@
       </w:tcPr>
     </w:tblStylePr>
   </w:style>
-  <w:style w:type="table" w:styleId="907">
+  <w:style w:type="table" w:styleId="913">
     <w:name w:val="List Table 6 Colorful - Accent 5"/>
-    <w:basedOn w:val="992"/>
+    <w:basedOn w:val="998"/>
     <w:uiPriority w:val="99"/>
     <w:pPr>
       <w:pBdr/>
@@ -35440,9 +35511,9 @@
       </w:tcPr>
     </w:tblStylePr>
   </w:style>
-  <w:style w:type="table" w:styleId="908">
+  <w:style w:type="table" w:styleId="914">
     <w:name w:val="List Table 6 Colorful - Accent 6"/>
-    <w:basedOn w:val="992"/>
+    <w:basedOn w:val="998"/>
     <w:uiPriority w:val="99"/>
     <w:pPr>
       <w:pBdr/>
@@ -35663,9 +35734,9 @@
       </w:tcPr>
     </w:tblStylePr>
   </w:style>
-  <w:style w:type="table" w:styleId="909">
+  <w:style w:type="table" w:styleId="915">
     <w:name w:val="List Table 7 Colorful"/>
-    <w:basedOn w:val="992"/>
+    <w:basedOn w:val="998"/>
     <w:uiPriority w:val="99"/>
     <w:pPr>
       <w:pBdr/>
@@ -35919,9 +35990,9 @@
       </w:tcPr>
     </w:tblStylePr>
   </w:style>
-  <w:style w:type="table" w:styleId="910">
+  <w:style w:type="table" w:styleId="916">
     <w:name w:val="List Table 7 Colorful - Accent 1"/>
-    <w:basedOn w:val="992"/>
+    <w:basedOn w:val="998"/>
     <w:uiPriority w:val="99"/>
     <w:pPr>
       <w:pBdr/>
@@ -36175,9 +36246,9 @@
       </w:tcPr>
     </w:tblStylePr>
   </w:style>
-  <w:style w:type="table" w:styleId="911">
+  <w:style w:type="table" w:styleId="917">
     <w:name w:val="List Table 7 Colorful - Accent 2"/>
-    <w:basedOn w:val="992"/>
+    <w:basedOn w:val="998"/>
     <w:uiPriority w:val="99"/>
     <w:pPr>
       <w:pBdr/>
@@ -36431,9 +36502,9 @@
       </w:tcPr>
     </w:tblStylePr>
   </w:style>
-  <w:style w:type="table" w:styleId="912">
+  <w:style w:type="table" w:styleId="918">
     <w:name w:val="List Table 7 Colorful - Accent 3"/>
-    <w:basedOn w:val="992"/>
+    <w:basedOn w:val="998"/>
     <w:uiPriority w:val="99"/>
     <w:pPr>
       <w:pBdr/>
@@ -36687,9 +36758,9 @@
       </w:tcPr>
     </w:tblStylePr>
   </w:style>
-  <w:style w:type="table" w:styleId="913">
+  <w:style w:type="table" w:styleId="919">
     <w:name w:val="List Table 7 Colorful - Accent 4"/>
-    <w:basedOn w:val="992"/>
+    <w:basedOn w:val="998"/>
     <w:uiPriority w:val="99"/>
     <w:pPr>
       <w:pBdr/>
@@ -36943,9 +37014,9 @@
       </w:tcPr>
     </w:tblStylePr>
   </w:style>
-  <w:style w:type="table" w:styleId="914">
+  <w:style w:type="table" w:styleId="920">
     <w:name w:val="List Table 7 Colorful - Accent 5"/>
-    <w:basedOn w:val="992"/>
+    <w:basedOn w:val="998"/>
     <w:uiPriority w:val="99"/>
     <w:pPr>
       <w:pBdr/>
@@ -37199,9 +37270,9 @@
       </w:tcPr>
     </w:tblStylePr>
   </w:style>
-  <w:style w:type="table" w:styleId="915">
+  <w:style w:type="table" w:styleId="921">
     <w:name w:val="List Table 7 Colorful - Accent 6"/>
-    <w:basedOn w:val="992"/>
+    <w:basedOn w:val="998"/>
     <w:uiPriority w:val="99"/>
     <w:pPr>
       <w:pBdr/>
@@ -37455,9 +37526,9 @@
       </w:tcPr>
     </w:tblStylePr>
   </w:style>
-  <w:style w:type="table" w:styleId="916">
+  <w:style w:type="table" w:styleId="922">
     <w:name w:val="Lined - Accent"/>
-    <w:basedOn w:val="992"/>
+    <w:basedOn w:val="998"/>
     <w:uiPriority w:val="99"/>
     <w:pPr>
       <w:pBdr/>
@@ -37692,9 +37763,9 @@
       </w:tcPr>
     </w:tblStylePr>
   </w:style>
-  <w:style w:type="table" w:styleId="917">
+  <w:style w:type="table" w:styleId="923">
     <w:name w:val="Lined - Accent 1"/>
-    <w:basedOn w:val="992"/>
+    <w:basedOn w:val="998"/>
     <w:uiPriority w:val="99"/>
     <w:pPr>
       <w:pBdr/>
@@ -37929,9 +38000,9 @@
       </w:tcPr>
     </w:tblStylePr>
   </w:style>
-  <w:style w:type="table" w:styleId="918">
+  <w:style w:type="table" w:styleId="924">
     <w:name w:val="Lined - Accent 2"/>
-    <w:basedOn w:val="992"/>
+    <w:basedOn w:val="998"/>
     <w:uiPriority w:val="99"/>
     <w:pPr>
       <w:pBdr/>
@@ -38166,9 +38237,9 @@
       </w:tcPr>
     </w:tblStylePr>
   </w:style>
-  <w:style w:type="table" w:styleId="919">
+  <w:style w:type="table" w:styleId="925">
     <w:name w:val="Lined - Accent 3"/>
-    <w:basedOn w:val="992"/>
+    <w:basedOn w:val="998"/>
     <w:uiPriority w:val="99"/>
     <w:pPr>
       <w:pBdr/>
@@ -38403,9 +38474,9 @@
       </w:tcPr>
     </w:tblStylePr>
   </w:style>
-  <w:style w:type="table" w:styleId="920">
+  <w:style w:type="table" w:styleId="926">
     <w:name w:val="Lined - Accent 4"/>
-    <w:basedOn w:val="992"/>
+    <w:basedOn w:val="998"/>
     <w:uiPriority w:val="99"/>
     <w:pPr>
       <w:pBdr/>
@@ -38640,9 +38711,9 @@
       </w:tcPr>
     </w:tblStylePr>
   </w:style>
-  <w:style w:type="table" w:styleId="921">
+  <w:style w:type="table" w:styleId="927">
     <w:name w:val="Lined - Accent 5"/>
-    <w:basedOn w:val="992"/>
+    <w:basedOn w:val="998"/>
     <w:uiPriority w:val="99"/>
     <w:pPr>
       <w:pBdr/>
@@ -38877,9 +38948,9 @@
       </w:tcPr>
     </w:tblStylePr>
   </w:style>
-  <w:style w:type="table" w:styleId="922">
+  <w:style w:type="table" w:styleId="928">
     <w:name w:val="Lined - Accent 6"/>
-    <w:basedOn w:val="992"/>
+    <w:basedOn w:val="998"/>
     <w:uiPriority w:val="99"/>
     <w:pPr>
       <w:pBdr/>
@@ -39114,9 +39185,9 @@
       </w:tcPr>
     </w:tblStylePr>
   </w:style>
-  <w:style w:type="table" w:styleId="923">
+  <w:style w:type="table" w:styleId="929">
     <w:name w:val="Bordered &amp; Lined - Accent"/>
-    <w:basedOn w:val="992"/>
+    <w:basedOn w:val="998"/>
     <w:uiPriority w:val="99"/>
     <w:pPr>
       <w:pBdr/>
@@ -39358,9 +39429,9 @@
       </w:tcPr>
     </w:tblStylePr>
   </w:style>
-  <w:style w:type="table" w:styleId="924">
+  <w:style w:type="table" w:styleId="930">
     <w:name w:val="Bordered &amp; Lined - Accent 1"/>
-    <w:basedOn w:val="992"/>
+    <w:basedOn w:val="998"/>
     <w:uiPriority w:val="99"/>
     <w:pPr>
       <w:pBdr/>
@@ -39602,9 +39673,9 @@
       </w:tcPr>
     </w:tblStylePr>
   </w:style>
-  <w:style w:type="table" w:styleId="925">
+  <w:style w:type="table" w:styleId="931">
     <w:name w:val="Bordered &amp; Lined - Accent 2"/>
-    <w:basedOn w:val="992"/>
+    <w:basedOn w:val="998"/>
     <w:uiPriority w:val="99"/>
     <w:pPr>
       <w:pBdr/>
@@ -39846,9 +39917,9 @@
       </w:tcPr>
     </w:tblStylePr>
   </w:style>
-  <w:style w:type="table" w:styleId="926">
+  <w:style w:type="table" w:styleId="932">
     <w:name w:val="Bordered &amp; Lined - Accent 3"/>
-    <w:basedOn w:val="992"/>
+    <w:basedOn w:val="998"/>
     <w:uiPriority w:val="99"/>
     <w:pPr>
       <w:pBdr/>
@@ -40090,9 +40161,9 @@
       </w:tcPr>
     </w:tblStylePr>
   </w:style>
-  <w:style w:type="table" w:styleId="927">
+  <w:style w:type="table" w:styleId="933">
     <w:name w:val="Bordered &amp; Lined - Accent 4"/>
-    <w:basedOn w:val="992"/>
+    <w:basedOn w:val="998"/>
     <w:uiPriority w:val="99"/>
     <w:pPr>
       <w:pBdr/>
@@ -40334,9 +40405,9 @@
       </w:tcPr>
     </w:tblStylePr>
   </w:style>
-  <w:style w:type="table" w:styleId="928">
+  <w:style w:type="table" w:styleId="934">
     <w:name w:val="Bordered &amp; Lined - Accent 5"/>
-    <w:basedOn w:val="992"/>
+    <w:basedOn w:val="998"/>
     <w:uiPriority w:val="99"/>
     <w:pPr>
       <w:pBdr/>
@@ -40578,9 +40649,9 @@
       </w:tcPr>
     </w:tblStylePr>
   </w:style>
-  <w:style w:type="table" w:styleId="929">
+  <w:style w:type="table" w:styleId="935">
     <w:name w:val="Bordered &amp; Lined - Accent 6"/>
-    <w:basedOn w:val="992"/>
+    <w:basedOn w:val="998"/>
     <w:uiPriority w:val="99"/>
     <w:pPr>
       <w:pBdr/>
@@ -40822,9 +40893,9 @@
       </w:tcPr>
     </w:tblStylePr>
   </w:style>
-  <w:style w:type="table" w:styleId="930">
+  <w:style w:type="table" w:styleId="936">
     <w:name w:val="Bordered"/>
-    <w:basedOn w:val="992"/>
+    <w:basedOn w:val="998"/>
     <w:uiPriority w:val="99"/>
     <w:pPr>
       <w:pBdr/>
@@ -41053,9 +41124,9 @@
       </w:tcPr>
     </w:tblStylePr>
   </w:style>
-  <w:style w:type="table" w:styleId="931">
+  <w:style w:type="table" w:styleId="937">
     <w:name w:val="Bordered - Accent 1"/>
-    <w:basedOn w:val="992"/>
+    <w:basedOn w:val="998"/>
     <w:uiPriority w:val="99"/>
     <w:pPr>
       <w:pBdr/>
@@ -41284,9 +41355,9 @@
       </w:tcPr>
     </w:tblStylePr>
   </w:style>
-  <w:style w:type="table" w:styleId="932">
+  <w:style w:type="table" w:styleId="938">
     <w:name w:val="Bordered - Accent 2"/>
-    <w:basedOn w:val="992"/>
+    <w:basedOn w:val="998"/>
     <w:uiPriority w:val="99"/>
     <w:pPr>
       <w:pBdr/>
@@ -41515,9 +41586,9 @@
       </w:tcPr>
     </w:tblStylePr>
   </w:style>
-  <w:style w:type="table" w:styleId="933">
+  <w:style w:type="table" w:styleId="939">
     <w:name w:val="Bordered - Accent 3"/>
-    <w:basedOn w:val="992"/>
+    <w:basedOn w:val="998"/>
     <w:uiPriority w:val="99"/>
     <w:pPr>
       <w:pBdr/>
@@ -41746,9 +41817,9 @@
       </w:tcPr>
     </w:tblStylePr>
   </w:style>
-  <w:style w:type="table" w:styleId="934">
+  <w:style w:type="table" w:styleId="940">
     <w:name w:val="Bordered - Accent 4"/>
-    <w:basedOn w:val="992"/>
+    <w:basedOn w:val="998"/>
     <w:uiPriority w:val="99"/>
     <w:pPr>
       <w:pBdr/>
@@ -41977,9 +42048,9 @@
       </w:tcPr>
     </w:tblStylePr>
   </w:style>
-  <w:style w:type="table" w:styleId="935">
+  <w:style w:type="table" w:styleId="941">
     <w:name w:val="Bordered - Accent 5"/>
-    <w:basedOn w:val="992"/>
+    <w:basedOn w:val="998"/>
     <w:uiPriority w:val="99"/>
     <w:pPr>
       <w:pBdr/>
@@ -42208,9 +42279,9 @@
       </w:tcPr>
     </w:tblStylePr>
   </w:style>
-  <w:style w:type="table" w:styleId="936">
+  <w:style w:type="table" w:styleId="942">
     <w:name w:val="Bordered - Accent 6"/>
-    <w:basedOn w:val="992"/>
+    <w:basedOn w:val="998"/>
     <w:uiPriority w:val="99"/>
     <w:pPr>
       <w:pBdr/>
@@ -42439,11 +42510,11 @@
       </w:tcPr>
     </w:tblStylePr>
   </w:style>
-  <w:style w:type="paragraph" w:styleId="937">
+  <w:style w:type="paragraph" w:styleId="943">
     <w:name w:val="Heading 7"/>
-    <w:basedOn w:val="984"/>
-    <w:next w:val="984"/>
-    <w:link w:val="946"/>
+    <w:basedOn w:val="990"/>
+    <w:next w:val="990"/>
+    <w:link w:val="952"/>
     <w:uiPriority w:val="9"/>
     <w:unhideWhenUsed/>
     <w:qFormat/>
@@ -42460,11 +42531,11 @@
       <w:color w:val="595959" w:themeColor="text1" w:themeTint="A6"/>
     </w:rPr>
   </w:style>
-  <w:style w:type="paragraph" w:styleId="938">
+  <w:style w:type="paragraph" w:styleId="944">
     <w:name w:val="Heading 8"/>
-    <w:basedOn w:val="984"/>
-    <w:next w:val="984"/>
-    <w:link w:val="947"/>
+    <w:basedOn w:val="990"/>
+    <w:next w:val="990"/>
+    <w:link w:val="953"/>
     <w:uiPriority w:val="9"/>
     <w:unhideWhenUsed/>
     <w:qFormat/>
@@ -42483,11 +42554,11 @@
       <w:color w:val="272727" w:themeColor="text1" w:themeTint="D8"/>
     </w:rPr>
   </w:style>
-  <w:style w:type="paragraph" w:styleId="939">
+  <w:style w:type="paragraph" w:styleId="945">
     <w:name w:val="Heading 9"/>
-    <w:basedOn w:val="984"/>
-    <w:next w:val="984"/>
-    <w:link w:val="948"/>
+    <w:basedOn w:val="990"/>
+    <w:next w:val="990"/>
+    <w:link w:val="954"/>
     <w:uiPriority w:val="9"/>
     <w:unhideWhenUsed/>
     <w:qFormat/>
@@ -42506,10 +42577,10 @@
       <w:color w:val="272727" w:themeColor="text1" w:themeTint="D8"/>
     </w:rPr>
   </w:style>
-  <w:style w:type="character" w:styleId="940">
+  <w:style w:type="character" w:styleId="946">
     <w:name w:val="Heading 1 Char"/>
-    <w:basedOn w:val="991"/>
-    <w:link w:val="985"/>
+    <w:basedOn w:val="997"/>
+    <w:link w:val="991"/>
     <w:uiPriority w:val="9"/>
     <w:pPr>
       <w:pBdr/>
@@ -42523,10 +42594,10 @@
       <w:szCs w:val="40"/>
     </w:rPr>
   </w:style>
-  <w:style w:type="character" w:styleId="941">
+  <w:style w:type="character" w:styleId="947">
     <w:name w:val="Heading 2 Char"/>
-    <w:basedOn w:val="991"/>
-    <w:link w:val="986"/>
+    <w:basedOn w:val="997"/>
+    <w:link w:val="992"/>
     <w:uiPriority w:val="9"/>
     <w:pPr>
       <w:pBdr/>
@@ -42540,10 +42611,10 @@
       <w:szCs w:val="32"/>
     </w:rPr>
   </w:style>
-  <w:style w:type="character" w:styleId="942">
+  <w:style w:type="character" w:styleId="948">
     <w:name w:val="Heading 3 Char"/>
-    <w:basedOn w:val="991"/>
-    <w:link w:val="987"/>
+    <w:basedOn w:val="997"/>
+    <w:link w:val="993"/>
     <w:uiPriority w:val="9"/>
     <w:pPr>
       <w:pBdr/>
@@ -42557,10 +42628,10 @@
       <w:szCs w:val="28"/>
     </w:rPr>
   </w:style>
-  <w:style w:type="character" w:styleId="943">
+  <w:style w:type="character" w:styleId="949">
     <w:name w:val="Heading 4 Char"/>
-    <w:basedOn w:val="991"/>
-    <w:link w:val="988"/>
+    <w:basedOn w:val="997"/>
+    <w:link w:val="994"/>
     <w:uiPriority w:val="9"/>
     <w:pPr>
       <w:pBdr/>
@@ -42574,10 +42645,10 @@
       <w:color w:val="0f4761" w:themeColor="accent1" w:themeShade="BF"/>
     </w:rPr>
   </w:style>
-  <w:style w:type="character" w:styleId="944">
+  <w:style w:type="character" w:styleId="950">
     <w:name w:val="Heading 5 Char"/>
-    <w:basedOn w:val="991"/>
-    <w:link w:val="989"/>
+    <w:basedOn w:val="997"/>
+    <w:link w:val="995"/>
     <w:uiPriority w:val="9"/>
     <w:pPr>
       <w:pBdr/>
@@ -42589,10 +42660,10 @@
       <w:color w:val="0f4761" w:themeColor="accent1" w:themeShade="BF"/>
     </w:rPr>
   </w:style>
-  <w:style w:type="character" w:styleId="945">
+  <w:style w:type="character" w:styleId="951">
     <w:name w:val="Heading 6 Char"/>
-    <w:basedOn w:val="991"/>
-    <w:link w:val="990"/>
+    <w:basedOn w:val="997"/>
+    <w:link w:val="996"/>
     <w:uiPriority w:val="9"/>
     <w:pPr>
       <w:pBdr/>
@@ -42606,10 +42677,10 @@
       <w:color w:val="595959" w:themeColor="text1" w:themeTint="A6"/>
     </w:rPr>
   </w:style>
-  <w:style w:type="character" w:styleId="946">
+  <w:style w:type="character" w:styleId="952">
     <w:name w:val="Heading 7 Char"/>
-    <w:basedOn w:val="991"/>
-    <w:link w:val="937"/>
+    <w:basedOn w:val="997"/>
+    <w:link w:val="943"/>
     <w:uiPriority w:val="9"/>
     <w:pPr>
       <w:pBdr/>
@@ -42621,10 +42692,10 @@
       <w:color w:val="595959" w:themeColor="text1" w:themeTint="A6"/>
     </w:rPr>
   </w:style>
-  <w:style w:type="character" w:styleId="947">
+  <w:style w:type="character" w:styleId="953">
     <w:name w:val="Heading 8 Char"/>
-    <w:basedOn w:val="991"/>
-    <w:link w:val="938"/>
+    <w:basedOn w:val="997"/>
+    <w:link w:val="944"/>
     <w:uiPriority w:val="9"/>
     <w:pPr>
       <w:pBdr/>
@@ -42638,10 +42709,10 @@
       <w:color w:val="272727" w:themeColor="text1" w:themeTint="D8"/>
     </w:rPr>
   </w:style>
-  <w:style w:type="character" w:styleId="948">
+  <w:style w:type="character" w:styleId="954">
     <w:name w:val="Heading 9 Char"/>
-    <w:basedOn w:val="991"/>
-    <w:link w:val="939"/>
+    <w:basedOn w:val="997"/>
+    <w:link w:val="945"/>
     <w:uiPriority w:val="9"/>
     <w:pPr>
       <w:pBdr/>
@@ -42655,10 +42726,10 @@
       <w:color w:val="272727" w:themeColor="text1" w:themeTint="D8"/>
     </w:rPr>
   </w:style>
-  <w:style w:type="character" w:styleId="949">
+  <w:style w:type="character" w:styleId="955">
     <w:name w:val="Title Char"/>
-    <w:basedOn w:val="991"/>
-    <w:link w:val="995"/>
+    <w:basedOn w:val="997"/>
+    <w:link w:val="1001"/>
     <w:uiPriority w:val="10"/>
     <w:pPr>
       <w:pBdr/>
@@ -42672,10 +42743,10 @@
       <w:szCs w:val="56"/>
     </w:rPr>
   </w:style>
-  <w:style w:type="character" w:styleId="950">
+  <w:style w:type="character" w:styleId="956">
     <w:name w:val="Subtitle Char"/>
-    <w:basedOn w:val="991"/>
-    <w:link w:val="1015"/>
+    <w:basedOn w:val="997"/>
+    <w:link w:val="1021"/>
     <w:uiPriority w:val="11"/>
     <w:pPr>
       <w:pBdr/>
@@ -42689,11 +42760,11 @@
       <w:szCs w:val="28"/>
     </w:rPr>
   </w:style>
-  <w:style w:type="paragraph" w:styleId="951">
+  <w:style w:type="paragraph" w:styleId="957">
     <w:name w:val="Quote"/>
-    <w:basedOn w:val="984"/>
-    <w:next w:val="984"/>
-    <w:link w:val="952"/>
+    <w:basedOn w:val="990"/>
+    <w:next w:val="990"/>
+    <w:link w:val="958"/>
     <w:uiPriority w:val="29"/>
     <w:qFormat/>
     <w:pPr>
@@ -42708,10 +42779,10 @@
       <w:color w:val="404040" w:themeColor="text1" w:themeTint="BF"/>
     </w:rPr>
   </w:style>
-  <w:style w:type="character" w:styleId="952">
+  <w:style w:type="character" w:styleId="958">
     <w:name w:val="Quote Char"/>
-    <w:basedOn w:val="991"/>
-    <w:link w:val="951"/>
+    <w:basedOn w:val="997"/>
+    <w:link w:val="957"/>
     <w:uiPriority w:val="29"/>
     <w:pPr>
       <w:pBdr/>
@@ -42724,9 +42795,9 @@
       <w:color w:val="404040" w:themeColor="text1" w:themeTint="BF"/>
     </w:rPr>
   </w:style>
-  <w:style w:type="character" w:styleId="953">
+  <w:style w:type="character" w:styleId="959">
     <w:name w:val="Intense Emphasis"/>
-    <w:basedOn w:val="991"/>
+    <w:basedOn w:val="997"/>
     <w:uiPriority w:val="21"/>
     <w:qFormat/>
     <w:pPr>
@@ -42740,11 +42811,11 @@
       <w:color w:val="0f4761" w:themeColor="accent1" w:themeShade="BF"/>
     </w:rPr>
   </w:style>
-  <w:style w:type="paragraph" w:styleId="954">
+  <w:style w:type="paragraph" w:styleId="960">
     <w:name w:val="Intense Quote"/>
-    <w:basedOn w:val="984"/>
-    <w:next w:val="984"/>
-    <w:link w:val="955"/>
+    <w:basedOn w:val="990"/>
+    <w:next w:val="990"/>
+    <w:link w:val="961"/>
     <w:uiPriority w:val="30"/>
     <w:qFormat/>
     <w:pPr>
@@ -42762,10 +42833,10 @@
       <w:color w:val="0f4761" w:themeColor="accent1" w:themeShade="BF"/>
     </w:rPr>
   </w:style>
-  <w:style w:type="character" w:styleId="955">
+  <w:style w:type="character" w:styleId="961">
     <w:name w:val="Intense Quote Char"/>
-    <w:basedOn w:val="991"/>
-    <w:link w:val="954"/>
+    <w:basedOn w:val="997"/>
+    <w:link w:val="960"/>
     <w:uiPriority w:val="30"/>
     <w:pPr>
       <w:pBdr/>
@@ -42778,9 +42849,9 @@
       <w:color w:val="0f4761" w:themeColor="accent1" w:themeShade="BF"/>
     </w:rPr>
   </w:style>
-  <w:style w:type="character" w:styleId="956">
+  <w:style w:type="character" w:styleId="962">
     <w:name w:val="Intense Reference"/>
-    <w:basedOn w:val="991"/>
+    <w:basedOn w:val="997"/>
     <w:uiPriority w:val="32"/>
     <w:qFormat/>
     <w:pPr>
@@ -42796,9 +42867,9 @@
       <w:spacing w:val="5"/>
     </w:rPr>
   </w:style>
-  <w:style w:type="paragraph" w:styleId="957">
+  <w:style w:type="paragraph" w:styleId="963">
     <w:name w:val="No Spacing"/>
-    <w:basedOn w:val="984"/>
+    <w:basedOn w:val="990"/>
     <w:uiPriority w:val="1"/>
     <w:qFormat/>
     <w:pPr>
@@ -42807,9 +42878,9 @@
       <w:ind/>
     </w:pPr>
   </w:style>
-  <w:style w:type="character" w:styleId="958">
+  <w:style w:type="character" w:styleId="964">
     <w:name w:val="Subtle Emphasis"/>
-    <w:basedOn w:val="991"/>
+    <w:basedOn w:val="997"/>
     <w:uiPriority w:val="19"/>
     <w:qFormat/>
     <w:pPr>
@@ -42823,9 +42894,9 @@
       <w:color w:val="404040" w:themeColor="text1" w:themeTint="BF"/>
     </w:rPr>
   </w:style>
-  <w:style w:type="character" w:styleId="959">
+  <w:style w:type="character" w:styleId="965">
     <w:name w:val="Emphasis"/>
-    <w:basedOn w:val="991"/>
+    <w:basedOn w:val="997"/>
     <w:uiPriority w:val="20"/>
     <w:qFormat/>
     <w:pPr>
@@ -42838,9 +42909,9 @@
       <w:iCs/>
     </w:rPr>
   </w:style>
-  <w:style w:type="character" w:styleId="960">
+  <w:style w:type="character" w:styleId="966">
     <w:name w:val="Strong"/>
-    <w:basedOn w:val="991"/>
+    <w:basedOn w:val="997"/>
     <w:uiPriority w:val="22"/>
     <w:qFormat/>
     <w:pPr>
@@ -42853,9 +42924,9 @@
       <w:bCs/>
     </w:rPr>
   </w:style>
-  <w:style w:type="character" w:styleId="961">
+  <w:style w:type="character" w:styleId="967">
     <w:name w:val="Subtle Reference"/>
-    <w:basedOn w:val="991"/>
+    <w:basedOn w:val="997"/>
     <w:uiPriority w:val="31"/>
     <w:qFormat/>
     <w:pPr>
@@ -42868,9 +42939,9 @@
       <w:color w:val="5a5a5a" w:themeColor="text1" w:themeTint="A5"/>
     </w:rPr>
   </w:style>
-  <w:style w:type="character" w:styleId="962">
+  <w:style w:type="character" w:styleId="968">
     <w:name w:val="Book Title"/>
-    <w:basedOn w:val="991"/>
+    <w:basedOn w:val="997"/>
     <w:uiPriority w:val="33"/>
     <w:qFormat/>
     <w:pPr>
@@ -42886,10 +42957,10 @@
       <w:spacing w:val="5"/>
     </w:rPr>
   </w:style>
-  <w:style w:type="character" w:styleId="963">
+  <w:style w:type="character" w:styleId="969">
     <w:name w:val="Header Char"/>
-    <w:basedOn w:val="991"/>
-    <w:link w:val="1005"/>
+    <w:basedOn w:val="997"/>
+    <w:link w:val="1011"/>
     <w:uiPriority w:val="99"/>
     <w:pPr>
       <w:pBdr/>
@@ -42897,10 +42968,10 @@
       <w:ind/>
     </w:pPr>
   </w:style>
-  <w:style w:type="character" w:styleId="964">
+  <w:style w:type="character" w:styleId="970">
     <w:name w:val="Footer Char"/>
-    <w:basedOn w:val="991"/>
-    <w:link w:val="998"/>
+    <w:basedOn w:val="997"/>
+    <w:link w:val="1004"/>
     <w:uiPriority w:val="99"/>
     <w:pPr>
       <w:pBdr/>
@@ -42908,10 +42979,10 @@
       <w:ind/>
     </w:pPr>
   </w:style>
-  <w:style w:type="paragraph" w:styleId="965">
+  <w:style w:type="paragraph" w:styleId="971">
     <w:name w:val="Caption"/>
-    <w:basedOn w:val="984"/>
-    <w:next w:val="984"/>
+    <w:basedOn w:val="990"/>
+    <w:next w:val="990"/>
     <w:uiPriority w:val="35"/>
     <w:unhideWhenUsed/>
     <w:qFormat/>
@@ -42928,10 +42999,10 @@
       <w:szCs w:val="18"/>
     </w:rPr>
   </w:style>
-  <w:style w:type="character" w:styleId="966">
+  <w:style w:type="character" w:styleId="972">
     <w:name w:val="Footnote Text Char"/>
-    <w:basedOn w:val="991"/>
-    <w:link w:val="1002"/>
+    <w:basedOn w:val="997"/>
+    <w:link w:val="1008"/>
     <w:uiPriority w:val="99"/>
     <w:semiHidden/>
     <w:pPr>
@@ -42944,10 +43015,10 @@
       <w:szCs w:val="20"/>
     </w:rPr>
   </w:style>
-  <w:style w:type="paragraph" w:styleId="967">
+  <w:style w:type="paragraph" w:styleId="973">
     <w:name w:val="endnote text"/>
-    <w:basedOn w:val="984"/>
-    <w:link w:val="968"/>
+    <w:basedOn w:val="990"/>
+    <w:link w:val="974"/>
     <w:uiPriority w:val="99"/>
     <w:semiHidden/>
     <w:unhideWhenUsed/>
@@ -42961,10 +43032,10 @@
       <w:szCs w:val="20"/>
     </w:rPr>
   </w:style>
-  <w:style w:type="character" w:styleId="968">
+  <w:style w:type="character" w:styleId="974">
     <w:name w:val="Endnote Text Char"/>
-    <w:basedOn w:val="991"/>
-    <w:link w:val="967"/>
+    <w:basedOn w:val="997"/>
+    <w:link w:val="973"/>
     <w:uiPriority w:val="99"/>
     <w:semiHidden/>
     <w:pPr>
@@ -42977,9 +43048,9 @@
       <w:szCs w:val="20"/>
     </w:rPr>
   </w:style>
-  <w:style w:type="character" w:styleId="969">
+  <w:style w:type="character" w:styleId="975">
     <w:name w:val="endnote reference"/>
-    <w:basedOn w:val="991"/>
+    <w:basedOn w:val="997"/>
     <w:uiPriority w:val="99"/>
     <w:semiHidden/>
     <w:unhideWhenUsed/>
@@ -42992,9 +43063,9 @@
       <w:vertAlign w:val="superscript"/>
     </w:rPr>
   </w:style>
-  <w:style w:type="character" w:styleId="970">
+  <w:style w:type="character" w:styleId="976">
     <w:name w:val="Hyperlink"/>
-    <w:basedOn w:val="991"/>
+    <w:basedOn w:val="997"/>
     <w:uiPriority w:val="99"/>
     <w:unhideWhenUsed/>
     <w:pPr>
@@ -43007,9 +43078,9 @@
       <w:u w:val="single"/>
     </w:rPr>
   </w:style>
-  <w:style w:type="character" w:styleId="971">
+  <w:style w:type="character" w:styleId="977">
     <w:name w:val="FollowedHyperlink"/>
-    <w:basedOn w:val="991"/>
+    <w:basedOn w:val="997"/>
     <w:uiPriority w:val="99"/>
     <w:semiHidden/>
     <w:unhideWhenUsed/>
@@ -43023,10 +43094,10 @@
       <w:u w:val="single"/>
     </w:rPr>
   </w:style>
-  <w:style w:type="paragraph" w:styleId="972">
+  <w:style w:type="paragraph" w:styleId="978">
     <w:name w:val="toc 1"/>
-    <w:basedOn w:val="984"/>
-    <w:next w:val="984"/>
+    <w:basedOn w:val="990"/>
+    <w:next w:val="990"/>
     <w:uiPriority w:val="39"/>
     <w:unhideWhenUsed/>
     <w:pPr>
@@ -43035,10 +43106,10 @@
       <w:ind/>
     </w:pPr>
   </w:style>
-  <w:style w:type="paragraph" w:styleId="973">
+  <w:style w:type="paragraph" w:styleId="979">
     <w:name w:val="toc 2"/>
-    <w:basedOn w:val="984"/>
-    <w:next w:val="984"/>
+    <w:basedOn w:val="990"/>
+    <w:next w:val="990"/>
     <w:uiPriority w:val="39"/>
     <w:unhideWhenUsed/>
     <w:pPr>
@@ -43047,10 +43118,10 @@
       <w:ind w:left="220"/>
     </w:pPr>
   </w:style>
-  <w:style w:type="paragraph" w:styleId="974">
+  <w:style w:type="paragraph" w:styleId="980">
     <w:name w:val="toc 3"/>
-    <w:basedOn w:val="984"/>
-    <w:next w:val="984"/>
+    <w:basedOn w:val="990"/>
+    <w:next w:val="990"/>
     <w:uiPriority w:val="39"/>
     <w:unhideWhenUsed/>
     <w:pPr>
@@ -43059,10 +43130,10 @@
       <w:ind w:left="440"/>
     </w:pPr>
   </w:style>
-  <w:style w:type="paragraph" w:styleId="975">
+  <w:style w:type="paragraph" w:styleId="981">
     <w:name w:val="toc 4"/>
-    <w:basedOn w:val="984"/>
-    <w:next w:val="984"/>
+    <w:basedOn w:val="990"/>
+    <w:next w:val="990"/>
     <w:uiPriority w:val="39"/>
     <w:unhideWhenUsed/>
     <w:pPr>
@@ -43071,10 +43142,10 @@
       <w:ind w:left="660"/>
     </w:pPr>
   </w:style>
-  <w:style w:type="paragraph" w:styleId="976">
+  <w:style w:type="paragraph" w:styleId="982">
     <w:name w:val="toc 5"/>
-    <w:basedOn w:val="984"/>
-    <w:next w:val="984"/>
+    <w:basedOn w:val="990"/>
+    <w:next w:val="990"/>
     <w:uiPriority w:val="39"/>
     <w:unhideWhenUsed/>
     <w:pPr>
@@ -43083,10 +43154,10 @@
       <w:ind w:left="880"/>
     </w:pPr>
   </w:style>
-  <w:style w:type="paragraph" w:styleId="977">
+  <w:style w:type="paragraph" w:styleId="983">
     <w:name w:val="toc 6"/>
-    <w:basedOn w:val="984"/>
-    <w:next w:val="984"/>
+    <w:basedOn w:val="990"/>
+    <w:next w:val="990"/>
     <w:uiPriority w:val="39"/>
     <w:unhideWhenUsed/>
     <w:pPr>
@@ -43095,10 +43166,10 @@
       <w:ind w:left="1100"/>
     </w:pPr>
   </w:style>
-  <w:style w:type="paragraph" w:styleId="978">
+  <w:style w:type="paragraph" w:styleId="984">
     <w:name w:val="toc 7"/>
-    <w:basedOn w:val="984"/>
-    <w:next w:val="984"/>
+    <w:basedOn w:val="990"/>
+    <w:next w:val="990"/>
     <w:uiPriority w:val="39"/>
     <w:unhideWhenUsed/>
     <w:pPr>
@@ -43107,10 +43178,10 @@
       <w:ind w:left="1320"/>
     </w:pPr>
   </w:style>
-  <w:style w:type="paragraph" w:styleId="979">
+  <w:style w:type="paragraph" w:styleId="985">
     <w:name w:val="toc 8"/>
-    <w:basedOn w:val="984"/>
-    <w:next w:val="984"/>
+    <w:basedOn w:val="990"/>
+    <w:next w:val="990"/>
     <w:uiPriority w:val="39"/>
     <w:unhideWhenUsed/>
     <w:pPr>
@@ -43119,10 +43190,10 @@
       <w:ind w:left="1540"/>
     </w:pPr>
   </w:style>
-  <w:style w:type="paragraph" w:styleId="980">
+  <w:style w:type="paragraph" w:styleId="986">
     <w:name w:val="toc 9"/>
-    <w:basedOn w:val="984"/>
-    <w:next w:val="984"/>
+    <w:basedOn w:val="990"/>
+    <w:next w:val="990"/>
     <w:uiPriority w:val="39"/>
     <w:unhideWhenUsed/>
     <w:pPr>
@@ -43131,9 +43202,9 @@
       <w:ind w:left="1760"/>
     </w:pPr>
   </w:style>
-  <w:style w:type="character" w:styleId="981">
+  <w:style w:type="character" w:styleId="987">
     <w:name w:val="Placeholder Text"/>
-    <w:basedOn w:val="991"/>
+    <w:basedOn w:val="997"/>
     <w:uiPriority w:val="99"/>
     <w:semiHidden/>
     <w:pPr>
@@ -43145,7 +43216,7 @@
       <w:color w:val="666666"/>
     </w:rPr>
   </w:style>
-  <w:style w:type="paragraph" w:styleId="982">
+  <w:style w:type="paragraph" w:styleId="988">
     <w:name w:val="TOC Heading"/>
     <w:uiPriority w:val="39"/>
     <w:unhideWhenUsed/>
@@ -43155,10 +43226,10 @@
       <w:ind/>
     </w:pPr>
   </w:style>
-  <w:style w:type="paragraph" w:styleId="983">
+  <w:style w:type="paragraph" w:styleId="989">
     <w:name w:val="table of figures"/>
-    <w:basedOn w:val="984"/>
-    <w:next w:val="984"/>
+    <w:basedOn w:val="990"/>
+    <w:next w:val="990"/>
     <w:uiPriority w:val="99"/>
     <w:unhideWhenUsed/>
     <w:pPr>
@@ -43167,7 +43238,7 @@
       <w:ind/>
     </w:pPr>
   </w:style>
-  <w:style w:type="paragraph" w:styleId="984" w:default="1">
+  <w:style w:type="paragraph" w:styleId="990" w:default="1">
     <w:name w:val="Normal"/>
     <w:qFormat/>
     <w:pPr>
@@ -43176,10 +43247,10 @@
       <w:ind/>
     </w:pPr>
   </w:style>
-  <w:style w:type="paragraph" w:styleId="985">
+  <w:style w:type="paragraph" w:styleId="991">
     <w:name w:val="Heading 1"/>
-    <w:basedOn w:val="984"/>
-    <w:next w:val="984"/>
+    <w:basedOn w:val="990"/>
+    <w:next w:val="990"/>
     <w:uiPriority w:val="9"/>
     <w:qFormat/>
     <w:pPr>
@@ -43196,10 +43267,10 @@
       <w:szCs w:val="48"/>
     </w:rPr>
   </w:style>
-  <w:style w:type="paragraph" w:styleId="986">
+  <w:style w:type="paragraph" w:styleId="992">
     <w:name w:val="Heading 2"/>
-    <w:basedOn w:val="984"/>
-    <w:next w:val="984"/>
+    <w:basedOn w:val="990"/>
+    <w:next w:val="990"/>
     <w:uiPriority w:val="9"/>
     <w:semiHidden/>
     <w:unhideWhenUsed/>
@@ -43218,10 +43289,10 @@
       <w:szCs w:val="36"/>
     </w:rPr>
   </w:style>
-  <w:style w:type="paragraph" w:styleId="987">
+  <w:style w:type="paragraph" w:styleId="993">
     <w:name w:val="Heading 3"/>
-    <w:basedOn w:val="984"/>
-    <w:next w:val="984"/>
+    <w:basedOn w:val="990"/>
+    <w:next w:val="990"/>
     <w:uiPriority w:val="9"/>
     <w:semiHidden/>
     <w:unhideWhenUsed/>
@@ -43240,10 +43311,10 @@
       <w:szCs w:val="24"/>
     </w:rPr>
   </w:style>
-  <w:style w:type="paragraph" w:styleId="988">
+  <w:style w:type="paragraph" w:styleId="994">
     <w:name w:val="Heading 4"/>
-    <w:basedOn w:val="984"/>
-    <w:next w:val="984"/>
+    <w:basedOn w:val="990"/>
+    <w:next w:val="990"/>
     <w:uiPriority w:val="9"/>
     <w:semiHidden/>
     <w:unhideWhenUsed/>
@@ -43262,10 +43333,10 @@
       <w:szCs w:val="24"/>
     </w:rPr>
   </w:style>
-  <w:style w:type="paragraph" w:styleId="989">
+  <w:style w:type="paragraph" w:styleId="995">
     <w:name w:val="Heading 5"/>
-    <w:basedOn w:val="984"/>
-    <w:next w:val="984"/>
+    <w:basedOn w:val="990"/>
+    <w:next w:val="990"/>
     <w:uiPriority w:val="9"/>
     <w:semiHidden/>
     <w:unhideWhenUsed/>
@@ -43282,10 +43353,10 @@
       <w:b/>
     </w:rPr>
   </w:style>
-  <w:style w:type="paragraph" w:styleId="990">
+  <w:style w:type="paragraph" w:styleId="996">
     <w:name w:val="Heading 6"/>
-    <w:basedOn w:val="984"/>
-    <w:next w:val="984"/>
+    <w:basedOn w:val="990"/>
+    <w:next w:val="990"/>
     <w:uiPriority w:val="9"/>
     <w:semiHidden/>
     <w:unhideWhenUsed/>
@@ -43304,7 +43375,7 @@
       <w:szCs w:val="20"/>
     </w:rPr>
   </w:style>
-  <w:style w:type="character" w:styleId="991" w:default="1">
+  <w:style w:type="character" w:styleId="997" w:default="1">
     <w:name w:val="Default Paragraph Font"/>
     <w:uiPriority w:val="1"/>
     <w:semiHidden/>
@@ -43315,7 +43386,7 @@
       <w:ind/>
     </w:pPr>
   </w:style>
-  <w:style w:type="table" w:styleId="992" w:default="1">
+  <w:style w:type="table" w:styleId="998" w:default="1">
     <w:name w:val="Normal Table"/>
     <w:uiPriority w:val="99"/>
     <w:semiHidden/>
@@ -43508,7 +43579,7 @@
       </w:tcPr>
     </w:tblStylePr>
   </w:style>
-  <w:style w:type="numbering" w:styleId="993" w:default="1">
+  <w:style w:type="numbering" w:styleId="999" w:default="1">
     <w:name w:val="No List"/>
     <w:uiPriority w:val="99"/>
     <w:semiHidden/>
@@ -43519,7 +43590,7 @@
       <w:ind/>
     </w:pPr>
   </w:style>
-  <w:style w:type="table" w:styleId="994" w:customStyle="1">
+  <w:style w:type="table" w:styleId="1000" w:customStyle="1">
     <w:name w:val="TableNormal"/>
     <w:pPr>
       <w:pBdr/>
@@ -43708,10 +43779,10 @@
       </w:tcPr>
     </w:tblStylePr>
   </w:style>
-  <w:style w:type="paragraph" w:styleId="995">
+  <w:style w:type="paragraph" w:styleId="1001">
     <w:name w:val="Title"/>
-    <w:basedOn w:val="984"/>
-    <w:next w:val="984"/>
+    <w:basedOn w:val="990"/>
+    <w:next w:val="990"/>
     <w:uiPriority w:val="10"/>
     <w:qFormat/>
     <w:pPr>
@@ -43727,9 +43798,9 @@
       <w:szCs w:val="72"/>
     </w:rPr>
   </w:style>
-  <w:style w:type="character" w:styleId="996" w:customStyle="1">
+  <w:style w:type="character" w:styleId="1002" w:customStyle="1">
     <w:name w:val="Título 3 Car"/>
-    <w:basedOn w:val="991"/>
+    <w:basedOn w:val="997"/>
     <w:uiPriority w:val="9"/>
     <w:pPr>
       <w:pBdr/>
@@ -43741,9 +43812,9 @@
       <w:color w:val="1f3763" w:themeColor="accent1" w:themeShade="7F"/>
     </w:rPr>
   </w:style>
-  <w:style w:type="table" w:styleId="997">
+  <w:style w:type="table" w:styleId="1003">
     <w:name w:val="Table Grid"/>
-    <w:basedOn w:val="992"/>
+    <w:basedOn w:val="998"/>
     <w:uiPriority w:val="39"/>
     <w:pPr>
       <w:pBdr/>
@@ -43933,10 +44004,10 @@
       </w:tcPr>
     </w:tblStylePr>
   </w:style>
-  <w:style w:type="paragraph" w:styleId="998">
+  <w:style w:type="paragraph" w:styleId="1004">
     <w:name w:val="Footer"/>
-    <w:basedOn w:val="984"/>
-    <w:link w:val="999"/>
+    <w:basedOn w:val="990"/>
+    <w:link w:val="1005"/>
     <w:uiPriority w:val="99"/>
     <w:unhideWhenUsed/>
     <w:pPr>
@@ -43949,10 +44020,10 @@
       <w:ind/>
     </w:pPr>
   </w:style>
-  <w:style w:type="character" w:styleId="999" w:customStyle="1">
+  <w:style w:type="character" w:styleId="1005" w:customStyle="1">
     <w:name w:val="Pie de página Car"/>
-    <w:basedOn w:val="991"/>
-    <w:link w:val="998"/>
+    <w:basedOn w:val="997"/>
+    <w:link w:val="1004"/>
     <w:uiPriority w:val="99"/>
     <w:pPr>
       <w:pBdr/>
@@ -43964,10 +44035,10 @@
       <w:szCs w:val="22"/>
     </w:rPr>
   </w:style>
-  <w:style w:type="paragraph" w:styleId="1000">
+  <w:style w:type="paragraph" w:styleId="1006">
     <w:name w:val="List Paragraph"/>
-    <w:basedOn w:val="984"/>
-    <w:link w:val="1001"/>
+    <w:basedOn w:val="990"/>
+    <w:link w:val="1007"/>
     <w:uiPriority w:val="34"/>
     <w:qFormat/>
     <w:pPr>
@@ -43977,9 +44048,9 @@
       <w:contextualSpacing w:val="true"/>
     </w:pPr>
   </w:style>
-  <w:style w:type="character" w:styleId="1001" w:customStyle="1">
+  <w:style w:type="character" w:styleId="1007" w:customStyle="1">
     <w:name w:val="Párrafo de lista Car"/>
-    <w:link w:val="1000"/>
+    <w:link w:val="1006"/>
     <w:uiPriority w:val="34"/>
     <w:pPr>
       <w:pBdr/>
@@ -43991,10 +44062,10 @@
       <w:szCs w:val="22"/>
     </w:rPr>
   </w:style>
-  <w:style w:type="paragraph" w:styleId="1002">
+  <w:style w:type="paragraph" w:styleId="1008">
     <w:name w:val="footnote text"/>
-    <w:basedOn w:val="984"/>
-    <w:link w:val="1003"/>
+    <w:basedOn w:val="990"/>
+    <w:link w:val="1009"/>
     <w:uiPriority w:val="99"/>
     <w:semiHidden/>
     <w:unhideWhenUsed/>
@@ -44009,10 +44080,10 @@
       <w:lang w:val="es-ES"/>
     </w:rPr>
   </w:style>
-  <w:style w:type="character" w:styleId="1003" w:customStyle="1">
+  <w:style w:type="character" w:styleId="1009" w:customStyle="1">
     <w:name w:val="Texto nota pie Car"/>
-    <w:basedOn w:val="991"/>
-    <w:link w:val="1002"/>
+    <w:basedOn w:val="997"/>
+    <w:link w:val="1008"/>
     <w:uiPriority w:val="99"/>
     <w:semiHidden/>
     <w:pPr>
@@ -44026,9 +44097,9 @@
       <w:lang w:val="es-ES"/>
     </w:rPr>
   </w:style>
-  <w:style w:type="character" w:styleId="1004">
+  <w:style w:type="character" w:styleId="1010">
     <w:name w:val="footnote reference"/>
-    <w:basedOn w:val="991"/>
+    <w:basedOn w:val="997"/>
     <w:unhideWhenUsed/>
     <w:pPr>
       <w:pBdr/>
@@ -44039,10 +44110,10 @@
       <w:vertAlign w:val="superscript"/>
     </w:rPr>
   </w:style>
-  <w:style w:type="paragraph" w:styleId="1005">
+  <w:style w:type="paragraph" w:styleId="1011">
     <w:name w:val="Header"/>
-    <w:basedOn w:val="984"/>
-    <w:link w:val="1006"/>
+    <w:basedOn w:val="990"/>
+    <w:link w:val="1012"/>
     <w:uiPriority w:val="99"/>
     <w:unhideWhenUsed/>
     <w:pPr>
@@ -44055,10 +44126,10 @@
       <w:ind/>
     </w:pPr>
   </w:style>
-  <w:style w:type="character" w:styleId="1006" w:customStyle="1">
+  <w:style w:type="character" w:styleId="1012" w:customStyle="1">
     <w:name w:val="Encabezado Car"/>
-    <w:basedOn w:val="991"/>
-    <w:link w:val="1005"/>
+    <w:basedOn w:val="997"/>
+    <w:link w:val="1011"/>
     <w:uiPriority w:val="99"/>
     <w:pPr>
       <w:pBdr/>
@@ -44070,10 +44141,10 @@
       <w:szCs w:val="22"/>
     </w:rPr>
   </w:style>
-  <w:style w:type="table" w:styleId="1007" w:customStyle="1">
+  <w:style w:type="table" w:styleId="1013" w:customStyle="1">
     <w:name w:val="Tabla con cuadrícula1"/>
-    <w:basedOn w:val="992"/>
-    <w:next w:val="997"/>
+    <w:basedOn w:val="998"/>
+    <w:next w:val="1003"/>
     <w:uiPriority w:val="39"/>
     <w:pPr>
       <w:pBdr/>
@@ -44263,10 +44334,10 @@
       </w:tcPr>
     </w:tblStylePr>
   </w:style>
-  <w:style w:type="paragraph" w:styleId="1008">
+  <w:style w:type="paragraph" w:styleId="1014">
     <w:name w:val="Balloon Text"/>
-    <w:basedOn w:val="984"/>
-    <w:link w:val="1009"/>
+    <w:basedOn w:val="990"/>
+    <w:link w:val="1015"/>
     <w:uiPriority w:val="99"/>
     <w:semiHidden/>
     <w:unhideWhenUsed/>
@@ -44281,10 +44352,10 @@
       <w:szCs w:val="18"/>
     </w:rPr>
   </w:style>
-  <w:style w:type="character" w:styleId="1009" w:customStyle="1">
+  <w:style w:type="character" w:styleId="1015" w:customStyle="1">
     <w:name w:val="Texto de globo Car"/>
-    <w:basedOn w:val="991"/>
-    <w:link w:val="1008"/>
+    <w:basedOn w:val="997"/>
+    <w:link w:val="1014"/>
     <w:uiPriority w:val="99"/>
     <w:semiHidden/>
     <w:pPr>
@@ -44298,9 +44369,9 @@
       <w:szCs w:val="18"/>
     </w:rPr>
   </w:style>
-  <w:style w:type="character" w:styleId="1010">
+  <w:style w:type="character" w:styleId="1016">
     <w:name w:val="annotation reference"/>
-    <w:basedOn w:val="991"/>
+    <w:basedOn w:val="997"/>
     <w:uiPriority w:val="99"/>
     <w:semiHidden/>
     <w:unhideWhenUsed/>
@@ -44314,10 +44385,10 @@
       <w:szCs w:val="16"/>
     </w:rPr>
   </w:style>
-  <w:style w:type="paragraph" w:styleId="1011">
+  <w:style w:type="paragraph" w:styleId="1017">
     <w:name w:val="annotation text"/>
-    <w:basedOn w:val="984"/>
-    <w:link w:val="1012"/>
+    <w:basedOn w:val="990"/>
+    <w:link w:val="1018"/>
     <w:uiPriority w:val="99"/>
     <w:unhideWhenUsed/>
     <w:pPr>
@@ -44330,10 +44401,10 @@
       <w:szCs w:val="20"/>
     </w:rPr>
   </w:style>
-  <w:style w:type="character" w:styleId="1012" w:customStyle="1">
+  <w:style w:type="character" w:styleId="1018" w:customStyle="1">
     <w:name w:val="Texto comentario Car"/>
-    <w:basedOn w:val="991"/>
-    <w:link w:val="1011"/>
+    <w:basedOn w:val="997"/>
+    <w:link w:val="1017"/>
     <w:uiPriority w:val="99"/>
     <w:pPr>
       <w:pBdr/>
@@ -44345,11 +44416,11 @@
       <w:szCs w:val="20"/>
     </w:rPr>
   </w:style>
-  <w:style w:type="paragraph" w:styleId="1013">
+  <w:style w:type="paragraph" w:styleId="1019">
     <w:name w:val="annotation subject"/>
-    <w:basedOn w:val="1011"/>
-    <w:next w:val="1011"/>
-    <w:link w:val="1014"/>
+    <w:basedOn w:val="1017"/>
+    <w:next w:val="1017"/>
+    <w:link w:val="1020"/>
     <w:uiPriority w:val="99"/>
     <w:semiHidden/>
     <w:unhideWhenUsed/>
@@ -44363,10 +44434,10 @@
       <w:bCs/>
     </w:rPr>
   </w:style>
-  <w:style w:type="character" w:styleId="1014" w:customStyle="1">
+  <w:style w:type="character" w:styleId="1020" w:customStyle="1">
     <w:name w:val="Asunto del comentario Car"/>
-    <w:basedOn w:val="1012"/>
-    <w:link w:val="1013"/>
+    <w:basedOn w:val="1018"/>
+    <w:link w:val="1019"/>
     <w:uiPriority w:val="99"/>
     <w:semiHidden/>
     <w:pPr>
@@ -44381,10 +44452,10 @@
       <w:szCs w:val="20"/>
     </w:rPr>
   </w:style>
-  <w:style w:type="paragraph" w:styleId="1015">
+  <w:style w:type="paragraph" w:styleId="1021">
     <w:name w:val="Subtitle"/>
-    <w:basedOn w:val="984"/>
-    <w:next w:val="984"/>
+    <w:basedOn w:val="990"/>
+    <w:next w:val="990"/>
     <w:uiPriority w:val="11"/>
     <w:qFormat/>
     <w:pPr>
@@ -44402,9 +44473,9 @@
       <w:szCs w:val="48"/>
     </w:rPr>
   </w:style>
-  <w:style w:type="table" w:styleId="1016" w:customStyle="1">
+  <w:style w:type="table" w:styleId="1022" w:customStyle="1">
     <w:name w:val="StGen0"/>
-    <w:basedOn w:val="994"/>
+    <w:basedOn w:val="1000"/>
     <w:pPr>
       <w:pBdr/>
       <w:spacing/>
@@ -44592,9 +44663,9 @@
       </w:tcPr>
     </w:tblStylePr>
   </w:style>
-  <w:style w:type="table" w:styleId="1017" w:customStyle="1">
+  <w:style w:type="table" w:styleId="1023" w:customStyle="1">
     <w:name w:val="StGen1"/>
-    <w:basedOn w:val="994"/>
+    <w:basedOn w:val="1000"/>
     <w:pPr>
       <w:pBdr/>
       <w:spacing/>
@@ -44782,9 +44853,9 @@
       </w:tcPr>
     </w:tblStylePr>
   </w:style>
-  <w:style w:type="table" w:styleId="1018" w:customStyle="1">
+  <w:style w:type="table" w:styleId="1024" w:customStyle="1">
     <w:name w:val="StGen2"/>
-    <w:basedOn w:val="994"/>
+    <w:basedOn w:val="1000"/>
     <w:pPr>
       <w:pBdr/>
       <w:spacing/>
@@ -44972,9 +45043,9 @@
       </w:tcPr>
     </w:tblStylePr>
   </w:style>
-  <w:style w:type="table" w:styleId="1019" w:customStyle="1">
+  <w:style w:type="table" w:styleId="1025" w:customStyle="1">
     <w:name w:val="StGen3"/>
-    <w:basedOn w:val="994"/>
+    <w:basedOn w:val="1000"/>
     <w:pPr>
       <w:pBdr/>
       <w:spacing/>
@@ -45162,9 +45233,9 @@
       </w:tcPr>
     </w:tblStylePr>
   </w:style>
-  <w:style w:type="table" w:styleId="1020" w:customStyle="1">
+  <w:style w:type="table" w:styleId="1026" w:customStyle="1">
     <w:name w:val="StGen4"/>
-    <w:basedOn w:val="994"/>
+    <w:basedOn w:val="1000"/>
     <w:pPr>
       <w:pBdr/>
       <w:spacing/>
@@ -45352,9 +45423,9 @@
       </w:tcPr>
     </w:tblStylePr>
   </w:style>
-  <w:style w:type="table" w:styleId="1021" w:customStyle="1">
+  <w:style w:type="table" w:styleId="1027" w:customStyle="1">
     <w:name w:val="StGen5"/>
-    <w:basedOn w:val="994"/>
+    <w:basedOn w:val="1000"/>
     <w:pPr>
       <w:pBdr/>
       <w:spacing/>
@@ -45542,9 +45613,9 @@
       </w:tcPr>
     </w:tblStylePr>
   </w:style>
-  <w:style w:type="table" w:styleId="1022" w:customStyle="1">
+  <w:style w:type="table" w:styleId="1028" w:customStyle="1">
     <w:name w:val="StGen6"/>
-    <w:basedOn w:val="994"/>
+    <w:basedOn w:val="1000"/>
     <w:pPr>
       <w:pBdr/>
       <w:spacing/>
@@ -45732,9 +45803,9 @@
       </w:tcPr>
     </w:tblStylePr>
   </w:style>
-  <w:style w:type="table" w:styleId="1023" w:customStyle="1">
+  <w:style w:type="table" w:styleId="1029" w:customStyle="1">
     <w:name w:val="StGen7"/>
-    <w:basedOn w:val="994"/>
+    <w:basedOn w:val="1000"/>
     <w:pPr>
       <w:pBdr/>
       <w:spacing/>
@@ -45922,9 +45993,9 @@
       </w:tcPr>
     </w:tblStylePr>
   </w:style>
-  <w:style w:type="table" w:styleId="1024" w:customStyle="1">
+  <w:style w:type="table" w:styleId="1030" w:customStyle="1">
     <w:name w:val="StGen8"/>
-    <w:basedOn w:val="994"/>
+    <w:basedOn w:val="1000"/>
     <w:pPr>
       <w:pBdr/>
       <w:spacing/>
@@ -46112,9 +46183,9 @@
       </w:tcPr>
     </w:tblStylePr>
   </w:style>
-  <w:style w:type="table" w:styleId="1025" w:customStyle="1">
+  <w:style w:type="table" w:styleId="1031" w:customStyle="1">
     <w:name w:val="StGen9"/>
-    <w:basedOn w:val="994"/>
+    <w:basedOn w:val="1000"/>
     <w:pPr>
       <w:pBdr/>
       <w:spacing/>
@@ -46302,9 +46373,9 @@
       </w:tcPr>
     </w:tblStylePr>
   </w:style>
-  <w:style w:type="table" w:styleId="1026" w:customStyle="1">
+  <w:style w:type="table" w:styleId="1032" w:customStyle="1">
     <w:name w:val="StGen10"/>
-    <w:basedOn w:val="994"/>
+    <w:basedOn w:val="1000"/>
     <w:pPr>
       <w:pBdr/>
       <w:spacing/>
@@ -46492,9 +46563,9 @@
       </w:tcPr>
     </w:tblStylePr>
   </w:style>
-  <w:style w:type="table" w:styleId="1027" w:customStyle="1">
+  <w:style w:type="table" w:styleId="1033" w:customStyle="1">
     <w:name w:val="StGen11"/>
-    <w:basedOn w:val="994"/>
+    <w:basedOn w:val="1000"/>
     <w:pPr>
       <w:pBdr/>
       <w:spacing/>
@@ -46682,9 +46753,9 @@
       </w:tcPr>
     </w:tblStylePr>
   </w:style>
-  <w:style w:type="table" w:styleId="1028" w:customStyle="1">
+  <w:style w:type="table" w:styleId="1034" w:customStyle="1">
     <w:name w:val="StGen12"/>
-    <w:basedOn w:val="994"/>
+    <w:basedOn w:val="1000"/>
     <w:pPr>
       <w:pBdr/>
       <w:spacing/>
@@ -46872,9 +46943,9 @@
       </w:tcPr>
     </w:tblStylePr>
   </w:style>
-  <w:style w:type="table" w:styleId="1029" w:customStyle="1">
+  <w:style w:type="table" w:styleId="1035" w:customStyle="1">
     <w:name w:val="StGen13"/>
-    <w:basedOn w:val="994"/>
+    <w:basedOn w:val="1000"/>
     <w:pPr>
       <w:pBdr/>
       <w:spacing/>
@@ -47062,9 +47133,9 @@
       </w:tcPr>
     </w:tblStylePr>
   </w:style>
-  <w:style w:type="table" w:styleId="1030" w:customStyle="1">
+  <w:style w:type="table" w:styleId="1036" w:customStyle="1">
     <w:name w:val="StGen14"/>
-    <w:basedOn w:val="994"/>
+    <w:basedOn w:val="1000"/>
     <w:pPr>
       <w:pBdr/>
       <w:spacing/>
@@ -47252,9 +47323,9 @@
       </w:tcPr>
     </w:tblStylePr>
   </w:style>
-  <w:style w:type="table" w:styleId="1031" w:customStyle="1">
+  <w:style w:type="table" w:styleId="1037" w:customStyle="1">
     <w:name w:val="StGen15"/>
-    <w:basedOn w:val="994"/>
+    <w:basedOn w:val="1000"/>
     <w:pPr>
       <w:pBdr/>
       <w:spacing/>

</xml_diff>